<commit_message>
Teacher - Exam Services Implementation
</commit_message>
<xml_diff>
--- a/OEMS - 20225/Document/System Design and Implementation.docx
+++ b/OEMS - 20225/Document/System Design and Implementation.docx
@@ -579,22 +579,12 @@
     </w:p>
     <w:p>
       <w:pPr>
-        <w:pStyle w:val="ListParagraph"/>
-        <w:numPr>
-          <w:ilvl w:val="0"/>
-          <w:numId w:val="7"/>
-        </w:numPr>
+        <w:pStyle w:val="Heading2"/>
         <w:rPr>
           <w:rFonts w:hint="eastAsia"/>
-          <w:b/>
-          <w:bCs/>
-        </w:rPr>
-      </w:pPr>
-      <w:r>
-        <w:rPr>
-          <w:b/>
-          <w:bCs/>
-        </w:rPr>
+        </w:rPr>
+      </w:pPr>
+      <w:r>
         <w:t>Role-based Access Control: (RBAC)</w:t>
       </w:r>
     </w:p>
@@ -1057,31 +1047,13 @@
     </w:p>
     <w:p>
       <w:pPr>
-        <w:pStyle w:val="ListParagraph"/>
-        <w:numPr>
-          <w:ilvl w:val="0"/>
-          <w:numId w:val="7"/>
-        </w:numPr>
+        <w:pStyle w:val="Heading2"/>
         <w:rPr>
           <w:rFonts w:hint="eastAsia"/>
-          <w:b/>
-          <w:bCs/>
-        </w:rPr>
-      </w:pPr>
-      <w:r>
-        <w:rPr>
-          <w:rFonts w:ascii="Times New Roman" w:hAnsi="Times New Roman"/>
-          <w:b/>
-          <w:bCs/>
-        </w:rPr>
-        <w:t>Technology</w:t>
-      </w:r>
-      <w:r>
-        <w:rPr>
-          <w:b/>
-          <w:bCs/>
-        </w:rPr>
-        <w:t xml:space="preserve"> Stack</w:t>
+        </w:rPr>
+      </w:pPr>
+      <w:r>
+        <w:t>Technology Stack</w:t>
       </w:r>
     </w:p>
     <w:tbl>
@@ -1960,68 +1932,26 @@
         </w:tc>
       </w:tr>
     </w:tbl>
+    <w:p/>
     <w:p>
       <w:pPr>
+        <w:pStyle w:val="Heading2"/>
         <w:rPr>
           <w:rFonts w:hint="eastAsia"/>
         </w:rPr>
       </w:pPr>
+      <w:r>
+        <w:t>Database Design</w:t>
+      </w:r>
     </w:p>
     <w:p>
       <w:pPr>
-        <w:pStyle w:val="Heading1"/>
-      </w:pPr>
-      <w:r>
-        <w:t xml:space="preserve">System </w:t>
-      </w:r>
-      <w:r>
-        <w:t>Implementation</w:t>
-      </w:r>
-    </w:p>
-    <w:p>
-      <w:pPr>
-        <w:pStyle w:val="Heading2"/>
-        <w:rPr>
-          <w:rFonts w:hint="eastAsia"/>
-        </w:rPr>
-      </w:pPr>
-      <w:r>
-        <w:t>Database Design</w:t>
-      </w:r>
-    </w:p>
-    <w:p>
-      <w:pPr>
-        <w:pStyle w:val="ListParagraph"/>
-        <w:numPr>
-          <w:ilvl w:val="0"/>
-          <w:numId w:val="25"/>
-        </w:numPr>
-        <w:rPr>
-          <w:rFonts w:ascii="Times New Roman" w:eastAsia="SimSun" w:hAnsi="Times New Roman"/>
-          <w:b/>
-          <w:bCs/>
-          <w:sz w:val="24"/>
-          <w:szCs w:val="24"/>
-        </w:rPr>
-      </w:pPr>
-      <w:r>
-        <w:rPr>
-          <w:rFonts w:ascii="Times New Roman" w:eastAsia="SimSun" w:hAnsi="Times New Roman"/>
-          <w:b/>
-          <w:bCs/>
-          <w:sz w:val="24"/>
-          <w:szCs w:val="24"/>
-        </w:rPr>
+        <w:pStyle w:val="Heading3"/>
+      </w:pPr>
+      <w:r>
         <w:t>身份与访问控制</w:t>
       </w:r>
       <w:r>
-        <w:rPr>
-          <w:rFonts w:ascii="Times New Roman" w:eastAsia="SimSun" w:hAnsi="Times New Roman"/>
-          <w:b/>
-          <w:bCs/>
-          <w:sz w:val="24"/>
-          <w:szCs w:val="24"/>
-        </w:rPr>
         <w:t xml:space="preserve"> (Identity &amp; Access Control)</w:t>
       </w:r>
     </w:p>
@@ -2331,14 +2261,7 @@
                 <w:rFonts w:ascii="Times New Roman" w:eastAsia="SimSun" w:hAnsi="Times New Roman"/>
                 <w:sz w:val="21"/>
               </w:rPr>
-              <w:t>用户</w:t>
-            </w:r>
-            <w:r>
-              <w:rPr>
-                <w:rFonts w:ascii="Times New Roman" w:eastAsia="SimSun" w:hAnsi="Times New Roman"/>
-                <w:sz w:val="21"/>
-              </w:rPr>
-              <w:t>编号</w:t>
+              <w:t>用户编号</w:t>
             </w:r>
           </w:p>
         </w:tc>
@@ -2410,14 +2333,7 @@
                 <w:rFonts w:ascii="Times New Roman" w:eastAsia="SimSun" w:hAnsi="Times New Roman"/>
                 <w:sz w:val="21"/>
               </w:rPr>
-              <w:t>v</w:t>
-            </w:r>
-            <w:r>
-              <w:rPr>
-                <w:rFonts w:ascii="Times New Roman" w:eastAsia="SimSun" w:hAnsi="Times New Roman"/>
-                <w:sz w:val="21"/>
-              </w:rPr>
-              <w:t>archar (10)</w:t>
+              <w:t>varchar (10)</w:t>
             </w:r>
           </w:p>
         </w:tc>
@@ -2512,6 +2428,7 @@
                 <w:sz w:val="21"/>
               </w:rPr>
             </w:pPr>
+            <w:proofErr w:type="spellStart"/>
             <w:r>
               <w:rPr>
                 <w:rFonts w:ascii="Times New Roman" w:eastAsia="SimSun" w:hAnsi="Times New Roman"/>
@@ -2526,6 +2443,7 @@
               </w:rPr>
               <w:t>ame</w:t>
             </w:r>
+            <w:proofErr w:type="spellEnd"/>
           </w:p>
         </w:tc>
         <w:tc>
@@ -2687,14 +2605,7 @@
                 <w:rFonts w:ascii="Times New Roman" w:eastAsia="SimSun" w:hAnsi="Times New Roman"/>
                 <w:sz w:val="21"/>
               </w:rPr>
-              <w:t xml:space="preserve">varchar </w:t>
-            </w:r>
-            <w:r>
-              <w:rPr>
-                <w:rFonts w:ascii="Times New Roman" w:eastAsia="SimSun" w:hAnsi="Times New Roman"/>
-                <w:sz w:val="21"/>
-              </w:rPr>
-              <w:t>(256)</w:t>
+              <w:t>varchar (256)</w:t>
             </w:r>
           </w:p>
         </w:tc>
@@ -2894,7 +2805,6 @@
                 <w:rFonts w:ascii="Times New Roman" w:eastAsia="SimSun" w:hAnsi="Times New Roman"/>
                 <w:sz w:val="21"/>
               </w:rPr>
-              <w:lastRenderedPageBreak/>
               <w:t>d</w:t>
             </w:r>
             <w:r>
@@ -3016,6 +2926,7 @@
                 <w:rFonts w:ascii="Times New Roman" w:eastAsia="SimSun" w:hAnsi="Times New Roman"/>
                 <w:sz w:val="21"/>
               </w:rPr>
+              <w:lastRenderedPageBreak/>
               <w:t>gender</w:t>
             </w:r>
           </w:p>
@@ -3151,14 +3062,7 @@
                 <w:rFonts w:ascii="Times New Roman" w:eastAsia="SimSun" w:hAnsi="Times New Roman"/>
                 <w:sz w:val="21"/>
               </w:rPr>
-              <w:t>e</w:t>
-            </w:r>
-            <w:r>
-              <w:rPr>
-                <w:rFonts w:ascii="Times New Roman" w:eastAsia="SimSun" w:hAnsi="Times New Roman"/>
-                <w:sz w:val="21"/>
-              </w:rPr>
-              <w:t>mail</w:t>
+              <w:t>email</w:t>
             </w:r>
           </w:p>
         </w:tc>
@@ -3286,21 +3190,7 @@
                 <w:rFonts w:ascii="Times New Roman" w:eastAsia="SimSun" w:hAnsi="Times New Roman"/>
                 <w:sz w:val="21"/>
               </w:rPr>
-              <w:t>p</w:t>
-            </w:r>
-            <w:r>
-              <w:rPr>
-                <w:rFonts w:ascii="Times New Roman" w:eastAsia="SimSun" w:hAnsi="Times New Roman"/>
-                <w:sz w:val="21"/>
-              </w:rPr>
-              <w:t>hone</w:t>
-            </w:r>
-            <w:r>
-              <w:rPr>
-                <w:rFonts w:ascii="Times New Roman" w:eastAsia="SimSun" w:hAnsi="Times New Roman"/>
-                <w:sz w:val="21"/>
-              </w:rPr>
-              <w:t>_number</w:t>
+              <w:t>phone_number</w:t>
             </w:r>
           </w:p>
         </w:tc>
@@ -4174,31 +4064,12 @@
     </w:p>
     <w:p>
       <w:pPr>
-        <w:pStyle w:val="ListParagraph"/>
-        <w:numPr>
-          <w:ilvl w:val="0"/>
-          <w:numId w:val="25"/>
-        </w:numPr>
-        <w:rPr>
-          <w:rFonts w:ascii="Times New Roman" w:hAnsi="Times New Roman"/>
-          <w:b/>
-          <w:bCs/>
-        </w:rPr>
-      </w:pPr>
-      <w:r>
-        <w:rPr>
-          <w:rFonts w:ascii="Times New Roman" w:eastAsia="SimSun" w:hAnsi="Times New Roman"/>
-          <w:b/>
-          <w:bCs/>
-        </w:rPr>
+        <w:pStyle w:val="Heading3"/>
+      </w:pPr>
+      <w:r>
         <w:t>学术结构与管理</w:t>
       </w:r>
       <w:r>
-        <w:rPr>
-          <w:rFonts w:ascii="Times New Roman" w:eastAsia="SimSun" w:hAnsi="Times New Roman"/>
-          <w:b/>
-          <w:bCs/>
-        </w:rPr>
         <w:t>(Academic Structure)</w:t>
       </w:r>
     </w:p>
@@ -4250,6 +4121,7 @@
         </w:rPr>
         <w:t>（</w:t>
       </w:r>
+      <w:proofErr w:type="spellStart"/>
       <w:r>
         <w:rPr>
           <w:rFonts w:ascii="Times New Roman" w:eastAsia="SimSun" w:hAnsi="Times New Roman"/>
@@ -4268,6 +4140,7 @@
         </w:rPr>
         <w:t>_info</w:t>
       </w:r>
+      <w:proofErr w:type="spellEnd"/>
       <w:r>
         <w:rPr>
           <w:rFonts w:ascii="SimSun" w:eastAsia="SimSun" w:hAnsi="SimSun"/>
@@ -5511,30 +5384,14 @@
                 <w:sz w:val="21"/>
               </w:rPr>
             </w:pPr>
-            <w:r>
-              <w:rPr>
-                <w:sz w:val="21"/>
-              </w:rPr>
-              <w:t>p</w:t>
-            </w:r>
-            <w:r>
-              <w:rPr>
-                <w:sz w:val="21"/>
-              </w:rPr>
-              <w:t>arent</w:t>
-            </w:r>
-            <w:r>
-              <w:rPr>
-                <w:sz w:val="21"/>
-              </w:rPr>
-              <w:t>_</w:t>
-            </w:r>
-            <w:r>
-              <w:rPr>
-                <w:sz w:val="21"/>
-              </w:rPr>
-              <w:t>id</w:t>
-            </w:r>
+            <w:proofErr w:type="spellStart"/>
+            <w:r>
+              <w:rPr>
+                <w:sz w:val="21"/>
+              </w:rPr>
+              <w:t>parent_id</w:t>
+            </w:r>
+            <w:proofErr w:type="spellEnd"/>
           </w:p>
         </w:tc>
         <w:tc>
@@ -5807,6 +5664,7 @@
         </w:rPr>
         <w:t>（</w:t>
       </w:r>
+      <w:proofErr w:type="spellStart"/>
       <w:r>
         <w:rPr>
           <w:rFonts w:ascii="SimSun" w:eastAsia="SimSun" w:hAnsi="SimSun"/>
@@ -5816,6 +5674,7 @@
         </w:rPr>
         <w:t>class_info</w:t>
       </w:r>
+      <w:proofErr w:type="spellEnd"/>
       <w:r>
         <w:rPr>
           <w:rFonts w:ascii="SimSun" w:eastAsia="SimSun" w:hAnsi="SimSun"/>
@@ -6824,7 +6683,6 @@
                 <w:sz w:val="21"/>
               </w:rPr>
             </w:pPr>
-            <w:proofErr w:type="spellStart"/>
             <w:r>
               <w:rPr>
                 <w:rFonts w:ascii="Times New Roman" w:eastAsia="SimSun" w:hAnsi="Times New Roman"/>
@@ -6846,7 +6704,6 @@
               </w:rPr>
               <w:t>serial</w:t>
             </w:r>
-            <w:proofErr w:type="spellEnd"/>
           </w:p>
         </w:tc>
         <w:tc>
@@ -7184,56 +7041,13 @@
     </w:p>
     <w:p>
       <w:pPr>
-        <w:pStyle w:val="ListParagraph"/>
-        <w:numPr>
-          <w:ilvl w:val="0"/>
-          <w:numId w:val="25"/>
-        </w:numPr>
-        <w:rPr>
-          <w:rFonts w:ascii="Times New Roman" w:hAnsi="Times New Roman"/>
-          <w:b/>
-          <w:bCs/>
-        </w:rPr>
-      </w:pPr>
-      <w:r>
-        <w:rPr>
-          <w:rFonts w:ascii="Times New Roman" w:hAnsi="Times New Roman"/>
-          <w:b/>
-          <w:bCs/>
-        </w:rPr>
-        <w:t>题库</w:t>
-      </w:r>
-      <w:r>
-        <w:rPr>
-          <w:rFonts w:ascii="Times New Roman" w:hAnsi="Times New Roman"/>
-          <w:b/>
-          <w:bCs/>
-        </w:rPr>
-        <w:t>系统</w:t>
-      </w:r>
-      <w:r>
-        <w:rPr>
-          <w:rFonts w:ascii="Times New Roman" w:hAnsi="Times New Roman"/>
-          <w:b/>
-          <w:bCs/>
-        </w:rPr>
-        <w:t xml:space="preserve"> (Question</w:t>
-      </w:r>
-      <w:r>
-        <w:rPr>
-          <w:rFonts w:ascii="Times New Roman" w:hAnsi="Times New Roman"/>
-          <w:b/>
-          <w:bCs/>
-        </w:rPr>
-        <w:t xml:space="preserve"> Repository</w:t>
-      </w:r>
-      <w:r>
-        <w:rPr>
-          <w:rFonts w:ascii="Times New Roman" w:hAnsi="Times New Roman"/>
-          <w:b/>
-          <w:bCs/>
-        </w:rPr>
-        <w:t>)</w:t>
+        <w:pStyle w:val="Heading3"/>
+      </w:pPr>
+      <w:r>
+        <w:t>题库系统</w:t>
+      </w:r>
+      <w:r>
+        <w:t xml:space="preserve"> (Question Repository)</w:t>
       </w:r>
     </w:p>
     <w:p>
@@ -7297,25 +7111,7 @@
           <w:bCs/>
           <w:sz w:val="21"/>
         </w:rPr>
-        <w:t>(</w:t>
-      </w:r>
-      <w:r>
-        <w:rPr>
-          <w:rFonts w:ascii="SimSun" w:eastAsia="SimSun" w:hAnsi="SimSun"/>
-          <w:b/>
-          <w:bCs/>
-          <w:sz w:val="21"/>
-        </w:rPr>
-        <w:t>question_b</w:t>
-      </w:r>
-      <w:r>
-        <w:rPr>
-          <w:rFonts w:ascii="SimSun" w:eastAsia="SimSun" w:hAnsi="SimSun"/>
-          <w:b/>
-          <w:bCs/>
-          <w:sz w:val="21"/>
-        </w:rPr>
-        <w:t>ank)</w:t>
+        <w:t>(question_bank)</w:t>
       </w:r>
     </w:p>
     <w:tbl>
@@ -7728,6 +7524,7 @@
                 <w:sz w:val="21"/>
               </w:rPr>
             </w:pPr>
+            <w:proofErr w:type="spellStart"/>
             <w:r>
               <w:rPr>
                 <w:rFonts w:ascii="Times New Roman" w:eastAsia="SimSun" w:hAnsi="Times New Roman"/>
@@ -7735,6 +7532,7 @@
               </w:rPr>
               <w:t>topic_id</w:t>
             </w:r>
+            <w:proofErr w:type="spellEnd"/>
           </w:p>
         </w:tc>
         <w:tc>
@@ -8289,6 +8087,7 @@
                 <w:sz w:val="21"/>
               </w:rPr>
             </w:pPr>
+            <w:proofErr w:type="spellStart"/>
             <w:r>
               <w:rPr>
                 <w:rFonts w:ascii="Times New Roman" w:eastAsia="SimSun" w:hAnsi="Times New Roman"/>
@@ -8296,6 +8095,7 @@
               </w:rPr>
               <w:t>lang_code</w:t>
             </w:r>
+            <w:proofErr w:type="spellEnd"/>
           </w:p>
         </w:tc>
         <w:tc>
@@ -8398,7 +8198,35 @@
                 <w:rFonts w:ascii="Times New Roman" w:eastAsia="SimSun" w:hAnsi="Times New Roman"/>
               </w:rPr>
               <w:lastRenderedPageBreak/>
-              <w:t>(zh, kh, en)</w:t>
+              <w:t>(</w:t>
+            </w:r>
+            <w:proofErr w:type="spellStart"/>
+            <w:r>
+              <w:rPr>
+                <w:rFonts w:ascii="Times New Roman" w:eastAsia="SimSun" w:hAnsi="Times New Roman"/>
+              </w:rPr>
+              <w:t>zh</w:t>
+            </w:r>
+            <w:proofErr w:type="spellEnd"/>
+            <w:r>
+              <w:rPr>
+                <w:rFonts w:ascii="Times New Roman" w:eastAsia="SimSun" w:hAnsi="Times New Roman"/>
+              </w:rPr>
+              <w:t xml:space="preserve">, </w:t>
+            </w:r>
+            <w:proofErr w:type="spellStart"/>
+            <w:r>
+              <w:rPr>
+                <w:rFonts w:ascii="Times New Roman" w:eastAsia="SimSun" w:hAnsi="Times New Roman"/>
+              </w:rPr>
+              <w:t>kh</w:t>
+            </w:r>
+            <w:proofErr w:type="spellEnd"/>
+            <w:r>
+              <w:rPr>
+                <w:rFonts w:ascii="Times New Roman" w:eastAsia="SimSun" w:hAnsi="Times New Roman"/>
+              </w:rPr>
+              <w:t>, en)</w:t>
             </w:r>
           </w:p>
         </w:tc>
@@ -8767,6 +8595,7 @@
                 <w:sz w:val="21"/>
               </w:rPr>
             </w:pPr>
+            <w:proofErr w:type="spellStart"/>
             <w:r>
               <w:rPr>
                 <w:rFonts w:ascii="Times New Roman" w:eastAsia="SimSun" w:hAnsi="Times New Roman"/>
@@ -8774,6 +8603,7 @@
               </w:rPr>
               <w:t>question_id</w:t>
             </w:r>
+            <w:proofErr w:type="spellEnd"/>
           </w:p>
         </w:tc>
         <w:tc>
@@ -9108,24 +8938,13 @@
     </w:p>
     <w:p>
       <w:pPr>
-        <w:pStyle w:val="ListParagraph"/>
-        <w:numPr>
-          <w:ilvl w:val="0"/>
-          <w:numId w:val="25"/>
-        </w:numPr>
-        <w:rPr>
-          <w:rFonts w:ascii="SimSun" w:eastAsia="SimSun" w:hAnsi="SimSun"/>
-          <w:b/>
-          <w:bCs/>
-        </w:rPr>
-      </w:pPr>
-      <w:r>
-        <w:rPr>
-          <w:rFonts w:ascii="SimSun" w:eastAsia="SimSun" w:hAnsi="SimSun"/>
-          <w:b/>
-          <w:bCs/>
-        </w:rPr>
-        <w:t>考试引擎与实时会话 (Exam Engine &amp; Session)</w:t>
+        <w:pStyle w:val="Heading3"/>
+      </w:pPr>
+      <w:r>
+        <w:t>考试引擎与实时会话</w:t>
+      </w:r>
+      <w:r>
+        <w:t xml:space="preserve"> (Exam Engine &amp; Session)</w:t>
       </w:r>
     </w:p>
     <w:p>
@@ -10855,12 +10674,14 @@
                 <w:sz w:val="21"/>
               </w:rPr>
             </w:pPr>
+            <w:proofErr w:type="spellStart"/>
             <w:r>
               <w:rPr>
                 <w:rFonts w:ascii="Times New Roman" w:eastAsia="SimSun" w:hAnsi="Times New Roman"/>
               </w:rPr>
               <w:t>jsonb</w:t>
             </w:r>
+            <w:proofErr w:type="spellEnd"/>
           </w:p>
         </w:tc>
         <w:tc>
@@ -11178,31 +10999,12 @@
     </w:p>
     <w:p>
       <w:pPr>
-        <w:pStyle w:val="ListParagraph"/>
-        <w:numPr>
-          <w:ilvl w:val="0"/>
-          <w:numId w:val="25"/>
-        </w:numPr>
-        <w:rPr>
-          <w:rFonts w:ascii="Times New Roman" w:eastAsia="SimSun" w:hAnsi="Times New Roman"/>
-          <w:b/>
-          <w:bCs/>
-        </w:rPr>
-      </w:pPr>
-      <w:r>
-        <w:rPr>
-          <w:rFonts w:ascii="Times New Roman" w:eastAsia="SimSun" w:hAnsi="Times New Roman"/>
-          <w:b/>
-          <w:bCs/>
-        </w:rPr>
+        <w:pStyle w:val="Heading3"/>
+      </w:pPr>
+      <w:r>
         <w:t>成绩与排行榜</w:t>
       </w:r>
       <w:r>
-        <w:rPr>
-          <w:rFonts w:ascii="Times New Roman" w:eastAsia="SimSun" w:hAnsi="Times New Roman"/>
-          <w:b/>
-          <w:bCs/>
-        </w:rPr>
         <w:t xml:space="preserve"> (Results &amp; Ranking)</w:t>
       </w:r>
     </w:p>
@@ -11245,6 +11047,7 @@
         </w:rPr>
         <w:t xml:space="preserve"> (</w:t>
       </w:r>
+      <w:proofErr w:type="spellStart"/>
       <w:r>
         <w:rPr>
           <w:rFonts w:ascii="SimSun" w:eastAsia="SimSun" w:hAnsi="SimSun"/>
@@ -11254,6 +11057,7 @@
         </w:rPr>
         <w:t>exam_ranking</w:t>
       </w:r>
+      <w:proofErr w:type="spellEnd"/>
       <w:r>
         <w:rPr>
           <w:rFonts w:ascii="SimSun" w:eastAsia="SimSun" w:hAnsi="SimSun"/>
@@ -12113,14 +11917,2279 @@
     </w:p>
     <w:p>
       <w:pPr>
-        <w:rPr>
-          <w:rFonts w:hint="eastAsia"/>
-        </w:rPr>
-      </w:pPr>
+        <w:pStyle w:val="Heading3"/>
+      </w:pPr>
+      <w:r>
+        <w:t>Exam Service Related</w:t>
+      </w:r>
     </w:p>
     <w:p>
       <w:pPr>
+        <w:spacing w:after="240" w:line="300" w:lineRule="exact"/>
+        <w:ind w:firstLine="422"/>
+        <w:jc w:val="center"/>
+        <w:rPr>
+          <w:rFonts w:ascii="SimSun" w:eastAsia="SimSun" w:hAnsi="SimSun"/>
+          <w:b/>
+          <w:bCs/>
+          <w:sz w:val="21"/>
+        </w:rPr>
+      </w:pPr>
+      <w:r>
+        <w:rPr>
+          <w:rFonts w:ascii="SimSun" w:eastAsia="SimSun" w:hAnsi="SimSun"/>
+          <w:b/>
+          <w:bCs/>
+          <w:sz w:val="21"/>
+        </w:rPr>
+        <w:t>表3.</w:t>
+      </w:r>
+      <w:r>
+        <w:rPr>
+          <w:rFonts w:ascii="SimSun" w:eastAsia="SimSun" w:hAnsi="SimSun"/>
+          <w:b/>
+          <w:bCs/>
+          <w:sz w:val="21"/>
+        </w:rPr>
+        <w:t>10</w:t>
+      </w:r>
+      <w:r>
+        <w:rPr>
+          <w:rFonts w:ascii="SimSun" w:eastAsia="SimSun" w:hAnsi="SimSun"/>
+          <w:b/>
+          <w:bCs/>
+          <w:sz w:val="21"/>
+        </w:rPr>
+        <w:t xml:space="preserve"> (</w:t>
+      </w:r>
+      <w:r>
+        <w:rPr>
+          <w:rFonts w:ascii="SimSun" w:eastAsia="SimSun" w:hAnsi="SimSun"/>
+          <w:b/>
+          <w:bCs/>
+          <w:sz w:val="21"/>
+        </w:rPr>
+        <w:t>exam_</w:t>
+      </w:r>
+      <w:r>
+        <w:rPr>
+          <w:rFonts w:ascii="SimSun" w:eastAsia="SimSun" w:hAnsi="SimSun"/>
+          <w:b/>
+          <w:bCs/>
+          <w:sz w:val="21"/>
+        </w:rPr>
+        <w:t>info</w:t>
+      </w:r>
+      <w:r>
+        <w:rPr>
+          <w:rFonts w:ascii="SimSun" w:eastAsia="SimSun" w:hAnsi="SimSun"/>
+          <w:b/>
+          <w:bCs/>
+          <w:sz w:val="21"/>
+        </w:rPr>
+        <w:t>)</w:t>
+      </w:r>
+    </w:p>
+    <w:tbl>
+      <w:tblPr>
+        <w:tblW w:w="9357" w:type="dxa"/>
+        <w:tblBorders>
+          <w:top w:val="single" w:sz="12" w:space="0" w:color="auto"/>
+          <w:left w:val="single" w:sz="12" w:space="0" w:color="E7E6E6"/>
+          <w:bottom w:val="single" w:sz="12" w:space="0" w:color="auto"/>
+          <w:right w:val="single" w:sz="12" w:space="0" w:color="E7E6E6"/>
+          <w:insideH w:val="single" w:sz="12" w:space="0" w:color="auto"/>
+          <w:insideV w:val="single" w:sz="12" w:space="0" w:color="E7E6E6"/>
+        </w:tblBorders>
+        <w:tblLayout w:type="fixed"/>
+        <w:tblLook w:val="0000" w:firstRow="0" w:lastRow="0" w:firstColumn="0" w:lastColumn="0" w:noHBand="0" w:noVBand="0"/>
+      </w:tblPr>
+      <w:tblGrid>
+        <w:gridCol w:w="2253"/>
+        <w:gridCol w:w="1701"/>
+        <w:gridCol w:w="2694"/>
+        <w:gridCol w:w="2709"/>
+      </w:tblGrid>
+      <w:tr>
+        <w:tc>
+          <w:tcPr>
+            <w:tcW w:w="2253" w:type="dxa"/>
+            <w:tcBorders>
+              <w:top w:val="single" w:sz="12" w:space="0" w:color="70AD47" w:themeColor="accent6"/>
+              <w:left w:val="single" w:sz="2" w:space="0" w:color="70AD47" w:themeColor="accent6"/>
+              <w:bottom w:val="single" w:sz="12" w:space="0" w:color="70AD47" w:themeColor="accent6"/>
+              <w:right w:val="single" w:sz="2" w:space="0" w:color="70AD47" w:themeColor="accent6"/>
+            </w:tcBorders>
+            <w:vAlign w:val="center"/>
+          </w:tcPr>
+          <w:p>
+            <w:pPr>
+              <w:spacing w:after="240" w:line="300" w:lineRule="exact"/>
+              <w:ind w:firstLine="422"/>
+              <w:jc w:val="center"/>
+              <w:rPr>
+                <w:rFonts w:ascii="SimSun" w:eastAsia="SimSun" w:hAnsi="SimSun"/>
+                <w:b/>
+                <w:bCs/>
+                <w:sz w:val="21"/>
+              </w:rPr>
+            </w:pPr>
+            <w:r>
+              <w:rPr>
+                <w:rFonts w:ascii="SimSun" w:eastAsia="SimSun" w:hAnsi="SimSun"/>
+                <w:b/>
+                <w:bCs/>
+                <w:sz w:val="21"/>
+              </w:rPr>
+              <w:t>字段名称</w:t>
+            </w:r>
+          </w:p>
+        </w:tc>
+        <w:tc>
+          <w:tcPr>
+            <w:tcW w:w="1701" w:type="dxa"/>
+            <w:tcBorders>
+              <w:top w:val="single" w:sz="12" w:space="0" w:color="70AD47" w:themeColor="accent6"/>
+              <w:left w:val="single" w:sz="2" w:space="0" w:color="70AD47" w:themeColor="accent6"/>
+              <w:bottom w:val="single" w:sz="12" w:space="0" w:color="70AD47" w:themeColor="accent6"/>
+              <w:right w:val="single" w:sz="2" w:space="0" w:color="70AD47" w:themeColor="accent6"/>
+            </w:tcBorders>
+            <w:vAlign w:val="center"/>
+          </w:tcPr>
+          <w:p>
+            <w:pPr>
+              <w:spacing w:after="240" w:line="300" w:lineRule="exact"/>
+              <w:ind w:firstLine="422"/>
+              <w:jc w:val="center"/>
+              <w:rPr>
+                <w:rFonts w:ascii="SimSun" w:eastAsia="SimSun" w:hAnsi="SimSun"/>
+                <w:b/>
+                <w:bCs/>
+                <w:sz w:val="21"/>
+              </w:rPr>
+            </w:pPr>
+            <w:r>
+              <w:rPr>
+                <w:rFonts w:ascii="SimSun" w:eastAsia="SimSun" w:hAnsi="SimSun"/>
+                <w:b/>
+                <w:bCs/>
+                <w:sz w:val="21"/>
+              </w:rPr>
+              <w:t>类型宽度</w:t>
+            </w:r>
+          </w:p>
+        </w:tc>
+        <w:tc>
+          <w:tcPr>
+            <w:tcW w:w="2694" w:type="dxa"/>
+            <w:tcBorders>
+              <w:top w:val="single" w:sz="12" w:space="0" w:color="70AD47" w:themeColor="accent6"/>
+              <w:left w:val="single" w:sz="2" w:space="0" w:color="70AD47" w:themeColor="accent6"/>
+              <w:bottom w:val="single" w:sz="12" w:space="0" w:color="70AD47" w:themeColor="accent6"/>
+              <w:right w:val="single" w:sz="2" w:space="0" w:color="70AD47" w:themeColor="accent6"/>
+            </w:tcBorders>
+            <w:vAlign w:val="center"/>
+          </w:tcPr>
+          <w:p>
+            <w:pPr>
+              <w:spacing w:after="240" w:line="300" w:lineRule="exact"/>
+              <w:ind w:firstLine="422"/>
+              <w:jc w:val="center"/>
+              <w:rPr>
+                <w:rFonts w:ascii="SimSun" w:eastAsia="SimSun" w:hAnsi="SimSun"/>
+                <w:b/>
+                <w:bCs/>
+                <w:sz w:val="21"/>
+              </w:rPr>
+            </w:pPr>
+            <w:r>
+              <w:rPr>
+                <w:rFonts w:ascii="SimSun" w:eastAsia="SimSun" w:hAnsi="SimSun"/>
+                <w:b/>
+                <w:bCs/>
+                <w:sz w:val="21"/>
+              </w:rPr>
+              <w:t>约束说明</w:t>
+            </w:r>
+          </w:p>
+        </w:tc>
+        <w:tc>
+          <w:tcPr>
+            <w:tcW w:w="2709" w:type="dxa"/>
+            <w:tcBorders>
+              <w:top w:val="single" w:sz="12" w:space="0" w:color="70AD47" w:themeColor="accent6"/>
+              <w:left w:val="single" w:sz="2" w:space="0" w:color="70AD47" w:themeColor="accent6"/>
+              <w:bottom w:val="single" w:sz="12" w:space="0" w:color="70AD47" w:themeColor="accent6"/>
+              <w:right w:val="single" w:sz="2" w:space="0" w:color="70AD47" w:themeColor="accent6"/>
+            </w:tcBorders>
+            <w:vAlign w:val="center"/>
+          </w:tcPr>
+          <w:p>
+            <w:pPr>
+              <w:spacing w:after="240" w:line="300" w:lineRule="exact"/>
+              <w:ind w:firstLine="422"/>
+              <w:jc w:val="center"/>
+              <w:rPr>
+                <w:rFonts w:ascii="SimSun" w:eastAsia="SimSun" w:hAnsi="SimSun"/>
+                <w:b/>
+                <w:bCs/>
+                <w:sz w:val="21"/>
+              </w:rPr>
+            </w:pPr>
+            <w:r>
+              <w:rPr>
+                <w:rFonts w:ascii="SimSun" w:eastAsia="SimSun" w:hAnsi="SimSun"/>
+                <w:b/>
+                <w:bCs/>
+                <w:sz w:val="21"/>
+              </w:rPr>
+              <w:t>功能说明</w:t>
+            </w:r>
+          </w:p>
+        </w:tc>
+      </w:tr>
+      <w:tr>
+        <w:tc>
+          <w:tcPr>
+            <w:tcW w:w="2253" w:type="dxa"/>
+            <w:tcBorders>
+              <w:top w:val="single" w:sz="12" w:space="0" w:color="70AD47" w:themeColor="accent6"/>
+              <w:left w:val="single" w:sz="2" w:space="0" w:color="70AD47" w:themeColor="accent6"/>
+              <w:bottom w:val="single" w:sz="2" w:space="0" w:color="70AD47" w:themeColor="accent6"/>
+              <w:right w:val="single" w:sz="2" w:space="0" w:color="70AD47" w:themeColor="accent6"/>
+            </w:tcBorders>
+            <w:vAlign w:val="center"/>
+          </w:tcPr>
+          <w:p>
+            <w:pPr>
+              <w:jc w:val="center"/>
+              <w:rPr>
+                <w:rFonts w:ascii="Times New Roman" w:eastAsia="SimSun" w:hAnsi="Times New Roman"/>
+                <w:color w:val="0070C0"/>
+                <w:sz w:val="21"/>
+              </w:rPr>
+            </w:pPr>
+            <w:r>
+              <w:rPr>
+                <w:rFonts w:ascii="Times New Roman" w:eastAsia="SimSun" w:hAnsi="Times New Roman"/>
+                <w:color w:val="0070C0"/>
+                <w:sz w:val="21"/>
+              </w:rPr>
+              <w:t>id</w:t>
+            </w:r>
+          </w:p>
+        </w:tc>
+        <w:tc>
+          <w:tcPr>
+            <w:tcW w:w="1701" w:type="dxa"/>
+            <w:tcBorders>
+              <w:top w:val="single" w:sz="12" w:space="0" w:color="70AD47" w:themeColor="accent6"/>
+              <w:left w:val="single" w:sz="2" w:space="0" w:color="70AD47" w:themeColor="accent6"/>
+              <w:bottom w:val="single" w:sz="2" w:space="0" w:color="70AD47" w:themeColor="accent6"/>
+              <w:right w:val="single" w:sz="2" w:space="0" w:color="70AD47" w:themeColor="accent6"/>
+            </w:tcBorders>
+            <w:vAlign w:val="center"/>
+          </w:tcPr>
+          <w:p>
+            <w:pPr>
+              <w:jc w:val="center"/>
+              <w:rPr>
+                <w:rFonts w:ascii="Times New Roman" w:eastAsia="SimSun" w:hAnsi="Times New Roman"/>
+                <w:color w:val="0070C0"/>
+                <w:sz w:val="21"/>
+              </w:rPr>
+            </w:pPr>
+            <w:r>
+              <w:rPr>
+                <w:rFonts w:ascii="Times New Roman" w:eastAsia="SimSun" w:hAnsi="Times New Roman"/>
+                <w:color w:val="0070C0"/>
+                <w:sz w:val="21"/>
+              </w:rPr>
+              <w:t>bigserial</w:t>
+            </w:r>
+          </w:p>
+        </w:tc>
+        <w:tc>
+          <w:tcPr>
+            <w:tcW w:w="2694" w:type="dxa"/>
+            <w:tcBorders>
+              <w:top w:val="single" w:sz="12" w:space="0" w:color="70AD47" w:themeColor="accent6"/>
+              <w:left w:val="single" w:sz="2" w:space="0" w:color="70AD47" w:themeColor="accent6"/>
+              <w:bottom w:val="single" w:sz="2" w:space="0" w:color="70AD47" w:themeColor="accent6"/>
+              <w:right w:val="single" w:sz="2" w:space="0" w:color="70AD47" w:themeColor="accent6"/>
+            </w:tcBorders>
+            <w:vAlign w:val="center"/>
+          </w:tcPr>
+          <w:p>
+            <w:pPr>
+              <w:jc w:val="center"/>
+              <w:rPr>
+                <w:rFonts w:ascii="Times New Roman" w:eastAsia="SimSun" w:hAnsi="Times New Roman"/>
+                <w:color w:val="0070C0"/>
+                <w:sz w:val="21"/>
+              </w:rPr>
+            </w:pPr>
+            <w:r>
+              <w:rPr>
+                <w:rFonts w:ascii="Times New Roman" w:eastAsia="SimSun" w:hAnsi="Times New Roman"/>
+                <w:color w:val="0070C0"/>
+                <w:sz w:val="21"/>
+              </w:rPr>
+              <w:t>KEY, NOT NULL</w:t>
+            </w:r>
+          </w:p>
+        </w:tc>
+        <w:tc>
+          <w:tcPr>
+            <w:tcW w:w="2709" w:type="dxa"/>
+            <w:tcBorders>
+              <w:top w:val="single" w:sz="12" w:space="0" w:color="70AD47" w:themeColor="accent6"/>
+              <w:left w:val="single" w:sz="2" w:space="0" w:color="70AD47" w:themeColor="accent6"/>
+              <w:bottom w:val="single" w:sz="2" w:space="0" w:color="70AD47" w:themeColor="accent6"/>
+              <w:right w:val="single" w:sz="2" w:space="0" w:color="70AD47" w:themeColor="accent6"/>
+            </w:tcBorders>
+            <w:vAlign w:val="center"/>
+          </w:tcPr>
+          <w:p>
+            <w:pPr>
+              <w:jc w:val="center"/>
+              <w:rPr>
+                <w:rFonts w:ascii="Times New Roman" w:eastAsia="SimSun" w:hAnsi="Times New Roman"/>
+                <w:color w:val="0070C0"/>
+                <w:sz w:val="21"/>
+              </w:rPr>
+            </w:pPr>
+            <w:r>
+              <w:rPr>
+                <w:rFonts w:ascii="Times New Roman" w:eastAsia="SimSun" w:hAnsi="Times New Roman" w:hint="eastAsia"/>
+                <w:color w:val="0070C0"/>
+              </w:rPr>
+              <w:t>考试</w:t>
+            </w:r>
+            <w:r>
+              <w:rPr>
+                <w:rFonts w:ascii="Times New Roman" w:eastAsia="SimSun" w:hAnsi="Times New Roman"/>
+                <w:color w:val="0070C0"/>
+              </w:rPr>
+              <w:t>唯一编号</w:t>
+            </w:r>
+          </w:p>
+        </w:tc>
+      </w:tr>
+      <w:tr>
+        <w:tc>
+          <w:tcPr>
+            <w:tcW w:w="2253" w:type="dxa"/>
+            <w:tcBorders>
+              <w:top w:val="single" w:sz="2" w:space="0" w:color="70AD47" w:themeColor="accent6"/>
+              <w:left w:val="single" w:sz="2" w:space="0" w:color="70AD47" w:themeColor="accent6"/>
+              <w:bottom w:val="single" w:sz="2" w:space="0" w:color="70AD47" w:themeColor="accent6"/>
+              <w:right w:val="single" w:sz="2" w:space="0" w:color="70AD47" w:themeColor="accent6"/>
+            </w:tcBorders>
+            <w:vAlign w:val="center"/>
+          </w:tcPr>
+          <w:p>
+            <w:pPr>
+              <w:jc w:val="center"/>
+              <w:rPr>
+                <w:rFonts w:ascii="Times New Roman" w:eastAsia="SimSun" w:hAnsi="Times New Roman"/>
+                <w:color w:val="FF0000"/>
+                <w:sz w:val="21"/>
+              </w:rPr>
+            </w:pPr>
+            <w:r>
+              <w:rPr>
+                <w:rFonts w:ascii="Times New Roman" w:eastAsia="SimSun" w:hAnsi="Times New Roman"/>
+                <w:color w:val="FF0000"/>
+                <w:sz w:val="21"/>
+              </w:rPr>
+              <w:t xml:space="preserve"> class_id</w:t>
+            </w:r>
+          </w:p>
+        </w:tc>
+        <w:tc>
+          <w:tcPr>
+            <w:tcW w:w="1701" w:type="dxa"/>
+            <w:tcBorders>
+              <w:top w:val="single" w:sz="2" w:space="0" w:color="70AD47" w:themeColor="accent6"/>
+              <w:left w:val="single" w:sz="2" w:space="0" w:color="70AD47" w:themeColor="accent6"/>
+              <w:bottom w:val="single" w:sz="2" w:space="0" w:color="70AD47" w:themeColor="accent6"/>
+              <w:right w:val="single" w:sz="2" w:space="0" w:color="70AD47" w:themeColor="accent6"/>
+            </w:tcBorders>
+            <w:vAlign w:val="center"/>
+          </w:tcPr>
+          <w:p>
+            <w:pPr>
+              <w:jc w:val="center"/>
+              <w:rPr>
+                <w:rFonts w:ascii="Times New Roman" w:eastAsia="SimSun" w:hAnsi="Times New Roman"/>
+                <w:color w:val="FF0000"/>
+                <w:sz w:val="21"/>
+              </w:rPr>
+            </w:pPr>
+            <w:r>
+              <w:rPr>
+                <w:rFonts w:ascii="Times New Roman" w:eastAsia="SimSun" w:hAnsi="Times New Roman"/>
+                <w:color w:val="FF0000"/>
+                <w:sz w:val="21"/>
+              </w:rPr>
+              <w:t>bigserial</w:t>
+            </w:r>
+          </w:p>
+        </w:tc>
+        <w:tc>
+          <w:tcPr>
+            <w:tcW w:w="2694" w:type="dxa"/>
+            <w:tcBorders>
+              <w:top w:val="single" w:sz="2" w:space="0" w:color="70AD47" w:themeColor="accent6"/>
+              <w:left w:val="single" w:sz="2" w:space="0" w:color="70AD47" w:themeColor="accent6"/>
+              <w:bottom w:val="single" w:sz="2" w:space="0" w:color="70AD47" w:themeColor="accent6"/>
+              <w:right w:val="single" w:sz="2" w:space="0" w:color="70AD47" w:themeColor="accent6"/>
+            </w:tcBorders>
+            <w:vAlign w:val="center"/>
+          </w:tcPr>
+          <w:p>
+            <w:pPr>
+              <w:jc w:val="center"/>
+              <w:rPr>
+                <w:rFonts w:ascii="Times New Roman" w:eastAsia="SimSun" w:hAnsi="Times New Roman"/>
+                <w:color w:val="FF0000"/>
+                <w:sz w:val="21"/>
+              </w:rPr>
+            </w:pPr>
+            <w:r>
+              <w:rPr>
+                <w:rFonts w:ascii="Times New Roman" w:eastAsia="SimSun" w:hAnsi="Times New Roman"/>
+                <w:color w:val="FF0000"/>
+                <w:sz w:val="21"/>
+              </w:rPr>
+              <w:t>NOT NULL, FK</w:t>
+            </w:r>
+          </w:p>
+        </w:tc>
+        <w:tc>
+          <w:tcPr>
+            <w:tcW w:w="2709" w:type="dxa"/>
+            <w:tcBorders>
+              <w:top w:val="single" w:sz="2" w:space="0" w:color="70AD47" w:themeColor="accent6"/>
+              <w:left w:val="single" w:sz="2" w:space="0" w:color="70AD47" w:themeColor="accent6"/>
+              <w:bottom w:val="single" w:sz="2" w:space="0" w:color="70AD47" w:themeColor="accent6"/>
+              <w:right w:val="single" w:sz="2" w:space="0" w:color="70AD47" w:themeColor="accent6"/>
+            </w:tcBorders>
+            <w:vAlign w:val="center"/>
+          </w:tcPr>
+          <w:p>
+            <w:pPr>
+              <w:jc w:val="center"/>
+              <w:rPr>
+                <w:rFonts w:ascii="Times New Roman" w:eastAsia="SimSun" w:hAnsi="Times New Roman"/>
+                <w:color w:val="FF0000"/>
+                <w:sz w:val="21"/>
+              </w:rPr>
+            </w:pPr>
+            <w:r>
+              <w:rPr>
+                <w:rFonts w:ascii="Times New Roman" w:eastAsia="SimSun" w:hAnsi="Times New Roman"/>
+                <w:color w:val="FF0000"/>
+              </w:rPr>
+              <w:t>班级编号</w:t>
+            </w:r>
+          </w:p>
+        </w:tc>
+      </w:tr>
+      <w:tr>
+        <w:tc>
+          <w:tcPr>
+            <w:tcW w:w="2253" w:type="dxa"/>
+            <w:tcBorders>
+              <w:top w:val="single" w:sz="2" w:space="0" w:color="70AD47" w:themeColor="accent6"/>
+              <w:left w:val="single" w:sz="2" w:space="0" w:color="70AD47" w:themeColor="accent6"/>
+              <w:bottom w:val="single" w:sz="2" w:space="0" w:color="70AD47" w:themeColor="accent6"/>
+              <w:right w:val="single" w:sz="2" w:space="0" w:color="70AD47" w:themeColor="accent6"/>
+            </w:tcBorders>
+            <w:vAlign w:val="center"/>
+          </w:tcPr>
+          <w:p>
+            <w:pPr>
+              <w:jc w:val="center"/>
+              <w:rPr>
+                <w:rFonts w:ascii="Times New Roman" w:eastAsia="SimSun" w:hAnsi="Times New Roman"/>
+                <w:color w:val="FF0000"/>
+                <w:sz w:val="21"/>
+              </w:rPr>
+            </w:pPr>
+            <w:r>
+              <w:rPr>
+                <w:rFonts w:ascii="Times New Roman" w:eastAsia="SimSun" w:hAnsi="Times New Roman"/>
+                <w:color w:val="FF0000"/>
+                <w:sz w:val="21"/>
+              </w:rPr>
+              <w:t>subject_id</w:t>
+            </w:r>
+          </w:p>
+        </w:tc>
+        <w:tc>
+          <w:tcPr>
+            <w:tcW w:w="1701" w:type="dxa"/>
+            <w:tcBorders>
+              <w:top w:val="single" w:sz="2" w:space="0" w:color="70AD47" w:themeColor="accent6"/>
+              <w:left w:val="single" w:sz="2" w:space="0" w:color="70AD47" w:themeColor="accent6"/>
+              <w:bottom w:val="single" w:sz="2" w:space="0" w:color="70AD47" w:themeColor="accent6"/>
+              <w:right w:val="single" w:sz="2" w:space="0" w:color="70AD47" w:themeColor="accent6"/>
+            </w:tcBorders>
+            <w:vAlign w:val="center"/>
+          </w:tcPr>
+          <w:p>
+            <w:pPr>
+              <w:jc w:val="center"/>
+              <w:rPr>
+                <w:rFonts w:ascii="Times New Roman" w:eastAsia="SimSun" w:hAnsi="Times New Roman"/>
+                <w:color w:val="FF0000"/>
+                <w:sz w:val="21"/>
+              </w:rPr>
+            </w:pPr>
+            <w:r>
+              <w:rPr>
+                <w:rFonts w:ascii="Times New Roman" w:eastAsia="SimSun" w:hAnsi="Times New Roman"/>
+                <w:color w:val="FF0000"/>
+                <w:sz w:val="21"/>
+              </w:rPr>
+              <w:t>bigserial</w:t>
+            </w:r>
+          </w:p>
+        </w:tc>
+        <w:tc>
+          <w:tcPr>
+            <w:tcW w:w="2694" w:type="dxa"/>
+            <w:tcBorders>
+              <w:top w:val="single" w:sz="2" w:space="0" w:color="70AD47" w:themeColor="accent6"/>
+              <w:left w:val="single" w:sz="2" w:space="0" w:color="70AD47" w:themeColor="accent6"/>
+              <w:bottom w:val="single" w:sz="2" w:space="0" w:color="70AD47" w:themeColor="accent6"/>
+              <w:right w:val="single" w:sz="2" w:space="0" w:color="70AD47" w:themeColor="accent6"/>
+            </w:tcBorders>
+            <w:vAlign w:val="center"/>
+          </w:tcPr>
+          <w:p>
+            <w:pPr>
+              <w:jc w:val="center"/>
+              <w:rPr>
+                <w:rFonts w:ascii="Times New Roman" w:eastAsia="SimSun" w:hAnsi="Times New Roman"/>
+                <w:color w:val="FF0000"/>
+                <w:sz w:val="21"/>
+              </w:rPr>
+            </w:pPr>
+            <w:r>
+              <w:rPr>
+                <w:rFonts w:ascii="Times New Roman" w:eastAsia="SimSun" w:hAnsi="Times New Roman"/>
+                <w:color w:val="FF0000"/>
+                <w:sz w:val="21"/>
+              </w:rPr>
+              <w:t>NOT NULL, FK</w:t>
+            </w:r>
+          </w:p>
+        </w:tc>
+        <w:tc>
+          <w:tcPr>
+            <w:tcW w:w="2709" w:type="dxa"/>
+            <w:tcBorders>
+              <w:top w:val="single" w:sz="2" w:space="0" w:color="70AD47" w:themeColor="accent6"/>
+              <w:left w:val="single" w:sz="2" w:space="0" w:color="70AD47" w:themeColor="accent6"/>
+              <w:bottom w:val="single" w:sz="2" w:space="0" w:color="70AD47" w:themeColor="accent6"/>
+              <w:right w:val="single" w:sz="2" w:space="0" w:color="70AD47" w:themeColor="accent6"/>
+            </w:tcBorders>
+            <w:vAlign w:val="center"/>
+          </w:tcPr>
+          <w:p>
+            <w:pPr>
+              <w:jc w:val="center"/>
+              <w:rPr>
+                <w:rFonts w:ascii="Times New Roman" w:eastAsia="SimSun" w:hAnsi="Times New Roman" w:hint="eastAsia"/>
+                <w:color w:val="FF0000"/>
+              </w:rPr>
+            </w:pPr>
+            <w:r>
+              <w:rPr>
+                <w:rFonts w:ascii="Times New Roman" w:eastAsia="SimSun" w:hAnsi="Times New Roman" w:hint="eastAsia"/>
+                <w:color w:val="FF0000"/>
+              </w:rPr>
+              <w:t>科目编号</w:t>
+            </w:r>
+          </w:p>
+        </w:tc>
+      </w:tr>
+      <w:tr>
+        <w:tc>
+          <w:tcPr>
+            <w:tcW w:w="2253" w:type="dxa"/>
+            <w:tcBorders>
+              <w:top w:val="single" w:sz="2" w:space="0" w:color="70AD47" w:themeColor="accent6"/>
+              <w:left w:val="single" w:sz="2" w:space="0" w:color="70AD47" w:themeColor="accent6"/>
+              <w:bottom w:val="single" w:sz="2" w:space="0" w:color="70AD47" w:themeColor="accent6"/>
+              <w:right w:val="single" w:sz="2" w:space="0" w:color="70AD47" w:themeColor="accent6"/>
+            </w:tcBorders>
+            <w:vAlign w:val="center"/>
+          </w:tcPr>
+          <w:p>
+            <w:pPr>
+              <w:jc w:val="center"/>
+              <w:rPr>
+                <w:rFonts w:ascii="Times New Roman" w:eastAsia="SimSun" w:hAnsi="Times New Roman"/>
+                <w:sz w:val="21"/>
+              </w:rPr>
+            </w:pPr>
+            <w:r>
+              <w:rPr>
+                <w:rFonts w:ascii="Times New Roman" w:eastAsia="SimSun" w:hAnsi="Times New Roman"/>
+                <w:sz w:val="21"/>
+              </w:rPr>
+              <w:t>exam_title</w:t>
+            </w:r>
+          </w:p>
+        </w:tc>
+        <w:tc>
+          <w:tcPr>
+            <w:tcW w:w="1701" w:type="dxa"/>
+            <w:tcBorders>
+              <w:top w:val="single" w:sz="2" w:space="0" w:color="70AD47" w:themeColor="accent6"/>
+              <w:left w:val="single" w:sz="2" w:space="0" w:color="70AD47" w:themeColor="accent6"/>
+              <w:bottom w:val="single" w:sz="2" w:space="0" w:color="70AD47" w:themeColor="accent6"/>
+              <w:right w:val="single" w:sz="2" w:space="0" w:color="70AD47" w:themeColor="accent6"/>
+            </w:tcBorders>
+            <w:vAlign w:val="center"/>
+          </w:tcPr>
+          <w:p>
+            <w:pPr>
+              <w:jc w:val="center"/>
+              <w:rPr>
+                <w:rFonts w:ascii="Times New Roman" w:eastAsia="SimSun" w:hAnsi="Times New Roman"/>
+                <w:sz w:val="21"/>
+              </w:rPr>
+            </w:pPr>
+            <w:r>
+              <w:rPr>
+                <w:rFonts w:ascii="Times New Roman" w:eastAsia="SimSun" w:hAnsi="Times New Roman"/>
+                <w:sz w:val="21"/>
+              </w:rPr>
+              <w:t>varchar(256)</w:t>
+            </w:r>
+          </w:p>
+        </w:tc>
+        <w:tc>
+          <w:tcPr>
+            <w:tcW w:w="2694" w:type="dxa"/>
+            <w:tcBorders>
+              <w:top w:val="single" w:sz="2" w:space="0" w:color="70AD47" w:themeColor="accent6"/>
+              <w:left w:val="single" w:sz="2" w:space="0" w:color="70AD47" w:themeColor="accent6"/>
+              <w:bottom w:val="single" w:sz="2" w:space="0" w:color="70AD47" w:themeColor="accent6"/>
+              <w:right w:val="single" w:sz="2" w:space="0" w:color="70AD47" w:themeColor="accent6"/>
+            </w:tcBorders>
+            <w:vAlign w:val="center"/>
+          </w:tcPr>
+          <w:p>
+            <w:pPr>
+              <w:jc w:val="center"/>
+              <w:rPr>
+                <w:rFonts w:ascii="Times New Roman" w:eastAsia="SimSun" w:hAnsi="Times New Roman" w:hint="eastAsia"/>
+                <w:sz w:val="21"/>
+              </w:rPr>
+            </w:pPr>
+            <w:r>
+              <w:rPr>
+                <w:rFonts w:ascii="Times New Roman" w:eastAsia="SimSun" w:hAnsi="Times New Roman"/>
+              </w:rPr>
+              <w:t>NOT NULL</w:t>
+            </w:r>
+          </w:p>
+        </w:tc>
+        <w:tc>
+          <w:tcPr>
+            <w:tcW w:w="2709" w:type="dxa"/>
+            <w:tcBorders>
+              <w:top w:val="single" w:sz="2" w:space="0" w:color="70AD47" w:themeColor="accent6"/>
+              <w:left w:val="single" w:sz="2" w:space="0" w:color="70AD47" w:themeColor="accent6"/>
+              <w:bottom w:val="single" w:sz="2" w:space="0" w:color="70AD47" w:themeColor="accent6"/>
+              <w:right w:val="single" w:sz="2" w:space="0" w:color="70AD47" w:themeColor="accent6"/>
+            </w:tcBorders>
+            <w:vAlign w:val="center"/>
+          </w:tcPr>
+          <w:p>
+            <w:pPr>
+              <w:jc w:val="center"/>
+              <w:rPr>
+                <w:rFonts w:ascii="Times New Roman" w:eastAsia="SimSun" w:hAnsi="Times New Roman"/>
+              </w:rPr>
+            </w:pPr>
+            <w:r>
+              <w:rPr>
+                <w:rFonts w:ascii="Times New Roman" w:eastAsia="SimSun" w:hAnsi="Times New Roman"/>
+              </w:rPr>
+              <w:t>考试标题</w:t>
+            </w:r>
+          </w:p>
+        </w:tc>
+      </w:tr>
+      <w:tr>
+        <w:tc>
+          <w:tcPr>
+            <w:tcW w:w="2253" w:type="dxa"/>
+            <w:tcBorders>
+              <w:top w:val="single" w:sz="2" w:space="0" w:color="70AD47" w:themeColor="accent6"/>
+              <w:left w:val="single" w:sz="2" w:space="0" w:color="70AD47" w:themeColor="accent6"/>
+              <w:bottom w:val="single" w:sz="2" w:space="0" w:color="70AD47" w:themeColor="accent6"/>
+              <w:right w:val="single" w:sz="2" w:space="0" w:color="70AD47" w:themeColor="accent6"/>
+            </w:tcBorders>
+            <w:vAlign w:val="center"/>
+          </w:tcPr>
+          <w:p>
+            <w:pPr>
+              <w:jc w:val="center"/>
+              <w:rPr>
+                <w:rFonts w:ascii="Times New Roman" w:eastAsia="SimSun" w:hAnsi="Times New Roman"/>
+                <w:sz w:val="21"/>
+              </w:rPr>
+            </w:pPr>
+            <w:r>
+              <w:rPr>
+                <w:rFonts w:ascii="Times New Roman" w:eastAsia="SimSun" w:hAnsi="Times New Roman"/>
+                <w:sz w:val="21"/>
+              </w:rPr>
+              <w:t>exam_date</w:t>
+            </w:r>
+          </w:p>
+        </w:tc>
+        <w:tc>
+          <w:tcPr>
+            <w:tcW w:w="1701" w:type="dxa"/>
+            <w:tcBorders>
+              <w:top w:val="single" w:sz="2" w:space="0" w:color="70AD47" w:themeColor="accent6"/>
+              <w:left w:val="single" w:sz="2" w:space="0" w:color="70AD47" w:themeColor="accent6"/>
+              <w:bottom w:val="single" w:sz="2" w:space="0" w:color="70AD47" w:themeColor="accent6"/>
+              <w:right w:val="single" w:sz="2" w:space="0" w:color="70AD47" w:themeColor="accent6"/>
+            </w:tcBorders>
+            <w:vAlign w:val="center"/>
+          </w:tcPr>
+          <w:p>
+            <w:pPr>
+              <w:jc w:val="center"/>
+              <w:rPr>
+                <w:rFonts w:ascii="Times New Roman" w:eastAsia="SimSun" w:hAnsi="Times New Roman"/>
+                <w:sz w:val="21"/>
+              </w:rPr>
+            </w:pPr>
+            <w:r>
+              <w:rPr>
+                <w:rFonts w:ascii="Times New Roman" w:eastAsia="SimSun" w:hAnsi="Times New Roman"/>
+                <w:sz w:val="21"/>
+              </w:rPr>
+              <w:t>timestampz</w:t>
+            </w:r>
+          </w:p>
+        </w:tc>
+        <w:tc>
+          <w:tcPr>
+            <w:tcW w:w="2694" w:type="dxa"/>
+            <w:tcBorders>
+              <w:top w:val="single" w:sz="2" w:space="0" w:color="70AD47" w:themeColor="accent6"/>
+              <w:left w:val="single" w:sz="2" w:space="0" w:color="70AD47" w:themeColor="accent6"/>
+              <w:bottom w:val="single" w:sz="2" w:space="0" w:color="70AD47" w:themeColor="accent6"/>
+              <w:right w:val="single" w:sz="2" w:space="0" w:color="70AD47" w:themeColor="accent6"/>
+            </w:tcBorders>
+            <w:vAlign w:val="center"/>
+          </w:tcPr>
+          <w:p>
+            <w:pPr>
+              <w:jc w:val="center"/>
+              <w:rPr>
+                <w:rFonts w:ascii="Times New Roman" w:eastAsia="SimSun" w:hAnsi="Times New Roman" w:hint="eastAsia"/>
+                <w:sz w:val="21"/>
+              </w:rPr>
+            </w:pPr>
+            <w:r>
+              <w:rPr>
+                <w:rFonts w:ascii="Times New Roman" w:eastAsia="SimSun" w:hAnsi="Times New Roman" w:hint="eastAsia"/>
+              </w:rPr>
+              <w:t>N</w:t>
+            </w:r>
+            <w:r>
+              <w:rPr>
+                <w:rFonts w:ascii="Times New Roman" w:eastAsia="SimSun" w:hAnsi="Times New Roman"/>
+              </w:rPr>
+              <w:t>OT NULL</w:t>
+            </w:r>
+          </w:p>
+        </w:tc>
+        <w:tc>
+          <w:tcPr>
+            <w:tcW w:w="2709" w:type="dxa"/>
+            <w:tcBorders>
+              <w:top w:val="single" w:sz="2" w:space="0" w:color="70AD47" w:themeColor="accent6"/>
+              <w:left w:val="single" w:sz="2" w:space="0" w:color="70AD47" w:themeColor="accent6"/>
+              <w:bottom w:val="single" w:sz="2" w:space="0" w:color="70AD47" w:themeColor="accent6"/>
+              <w:right w:val="single" w:sz="2" w:space="0" w:color="70AD47" w:themeColor="accent6"/>
+            </w:tcBorders>
+            <w:vAlign w:val="center"/>
+          </w:tcPr>
+          <w:p>
+            <w:pPr>
+              <w:jc w:val="center"/>
+              <w:rPr>
+                <w:rFonts w:ascii="Times New Roman" w:eastAsia="SimSun" w:hAnsi="Times New Roman"/>
+              </w:rPr>
+            </w:pPr>
+            <w:r>
+              <w:rPr>
+                <w:rFonts w:ascii="Times New Roman" w:eastAsia="SimSun" w:hAnsi="Times New Roman" w:hint="eastAsia"/>
+              </w:rPr>
+              <w:t>考试开始时间</w:t>
+            </w:r>
+          </w:p>
+        </w:tc>
+      </w:tr>
+      <w:tr>
+        <w:tc>
+          <w:tcPr>
+            <w:tcW w:w="2253" w:type="dxa"/>
+            <w:tcBorders>
+              <w:top w:val="single" w:sz="2" w:space="0" w:color="70AD47" w:themeColor="accent6"/>
+              <w:left w:val="single" w:sz="2" w:space="0" w:color="70AD47" w:themeColor="accent6"/>
+              <w:bottom w:val="single" w:sz="2" w:space="0" w:color="70AD47" w:themeColor="accent6"/>
+              <w:right w:val="single" w:sz="2" w:space="0" w:color="70AD47" w:themeColor="accent6"/>
+            </w:tcBorders>
+            <w:vAlign w:val="center"/>
+          </w:tcPr>
+          <w:p>
+            <w:pPr>
+              <w:jc w:val="center"/>
+              <w:rPr>
+                <w:rFonts w:ascii="Times New Roman" w:eastAsia="SimSun" w:hAnsi="Times New Roman"/>
+                <w:sz w:val="21"/>
+              </w:rPr>
+            </w:pPr>
+            <w:r>
+              <w:rPr>
+                <w:rFonts w:ascii="Times New Roman" w:eastAsia="SimSun" w:hAnsi="Times New Roman"/>
+                <w:sz w:val="21"/>
+              </w:rPr>
+              <w:t>duration</w:t>
+            </w:r>
+          </w:p>
+        </w:tc>
+        <w:tc>
+          <w:tcPr>
+            <w:tcW w:w="1701" w:type="dxa"/>
+            <w:tcBorders>
+              <w:top w:val="single" w:sz="2" w:space="0" w:color="70AD47" w:themeColor="accent6"/>
+              <w:left w:val="single" w:sz="2" w:space="0" w:color="70AD47" w:themeColor="accent6"/>
+              <w:bottom w:val="single" w:sz="2" w:space="0" w:color="70AD47" w:themeColor="accent6"/>
+              <w:right w:val="single" w:sz="2" w:space="0" w:color="70AD47" w:themeColor="accent6"/>
+            </w:tcBorders>
+            <w:vAlign w:val="center"/>
+          </w:tcPr>
+          <w:p>
+            <w:pPr>
+              <w:jc w:val="center"/>
+              <w:rPr>
+                <w:rFonts w:ascii="Times New Roman" w:eastAsia="SimSun" w:hAnsi="Times New Roman"/>
+                <w:sz w:val="21"/>
+              </w:rPr>
+            </w:pPr>
+            <w:r>
+              <w:rPr>
+                <w:rFonts w:ascii="Times New Roman" w:eastAsia="SimSun" w:hAnsi="Times New Roman"/>
+                <w:sz w:val="21"/>
+              </w:rPr>
+              <w:t>int</w:t>
+            </w:r>
+          </w:p>
+        </w:tc>
+        <w:tc>
+          <w:tcPr>
+            <w:tcW w:w="2694" w:type="dxa"/>
+            <w:tcBorders>
+              <w:top w:val="single" w:sz="2" w:space="0" w:color="70AD47" w:themeColor="accent6"/>
+              <w:left w:val="single" w:sz="2" w:space="0" w:color="70AD47" w:themeColor="accent6"/>
+              <w:bottom w:val="single" w:sz="2" w:space="0" w:color="70AD47" w:themeColor="accent6"/>
+              <w:right w:val="single" w:sz="2" w:space="0" w:color="70AD47" w:themeColor="accent6"/>
+            </w:tcBorders>
+            <w:vAlign w:val="center"/>
+          </w:tcPr>
+          <w:p>
+            <w:pPr>
+              <w:jc w:val="center"/>
+              <w:rPr>
+                <w:rFonts w:ascii="Times New Roman" w:eastAsia="SimSun" w:hAnsi="Times New Roman"/>
+                <w:sz w:val="21"/>
+              </w:rPr>
+            </w:pPr>
+            <w:r>
+              <w:rPr>
+                <w:rFonts w:ascii="Times New Roman" w:eastAsia="SimSun" w:hAnsi="Times New Roman"/>
+                <w:sz w:val="21"/>
+              </w:rPr>
+              <w:t>NOT NULL</w:t>
+            </w:r>
+          </w:p>
+        </w:tc>
+        <w:tc>
+          <w:tcPr>
+            <w:tcW w:w="2709" w:type="dxa"/>
+            <w:tcBorders>
+              <w:top w:val="single" w:sz="2" w:space="0" w:color="70AD47" w:themeColor="accent6"/>
+              <w:left w:val="single" w:sz="2" w:space="0" w:color="70AD47" w:themeColor="accent6"/>
+              <w:bottom w:val="single" w:sz="2" w:space="0" w:color="70AD47" w:themeColor="accent6"/>
+              <w:right w:val="single" w:sz="2" w:space="0" w:color="70AD47" w:themeColor="accent6"/>
+            </w:tcBorders>
+            <w:vAlign w:val="center"/>
+          </w:tcPr>
+          <w:p>
+            <w:pPr>
+              <w:jc w:val="center"/>
+              <w:rPr>
+                <w:rFonts w:ascii="Times New Roman" w:eastAsia="SimSun" w:hAnsi="Times New Roman"/>
+              </w:rPr>
+            </w:pPr>
+            <w:r>
+              <w:rPr>
+                <w:rFonts w:ascii="Times New Roman" w:eastAsia="SimSun" w:hAnsi="Times New Roman"/>
+              </w:rPr>
+              <w:t>考试时长</w:t>
+            </w:r>
+            <w:r>
+              <w:rPr>
+                <w:rFonts w:ascii="Times New Roman" w:eastAsia="SimSun" w:hAnsi="Times New Roman"/>
+              </w:rPr>
+              <w:t xml:space="preserve"> (</w:t>
+            </w:r>
+            <w:r>
+              <w:rPr>
+                <w:rFonts w:ascii="Times New Roman" w:eastAsia="SimSun" w:hAnsi="Times New Roman"/>
+              </w:rPr>
+              <w:t>分钟</w:t>
+            </w:r>
+            <w:r>
+              <w:rPr>
+                <w:rFonts w:ascii="Times New Roman" w:eastAsia="SimSun" w:hAnsi="Times New Roman"/>
+              </w:rPr>
+              <w:t>)</w:t>
+            </w:r>
+          </w:p>
+        </w:tc>
+      </w:tr>
+      <w:tr>
+        <w:tc>
+          <w:tcPr>
+            <w:tcW w:w="2253" w:type="dxa"/>
+            <w:tcBorders>
+              <w:top w:val="single" w:sz="2" w:space="0" w:color="70AD47" w:themeColor="accent6"/>
+              <w:left w:val="single" w:sz="2" w:space="0" w:color="70AD47" w:themeColor="accent6"/>
+              <w:bottom w:val="single" w:sz="2" w:space="0" w:color="70AD47" w:themeColor="accent6"/>
+              <w:right w:val="single" w:sz="2" w:space="0" w:color="70AD47" w:themeColor="accent6"/>
+            </w:tcBorders>
+            <w:vAlign w:val="center"/>
+          </w:tcPr>
+          <w:p>
+            <w:pPr>
+              <w:jc w:val="center"/>
+              <w:rPr>
+                <w:rFonts w:ascii="Times New Roman" w:eastAsia="SimSun" w:hAnsi="Times New Roman"/>
+                <w:sz w:val="21"/>
+              </w:rPr>
+            </w:pPr>
+            <w:r>
+              <w:rPr>
+                <w:rFonts w:ascii="Times New Roman" w:eastAsia="SimSun" w:hAnsi="Times New Roman"/>
+                <w:color w:val="FF0000"/>
+                <w:sz w:val="21"/>
+              </w:rPr>
+              <w:t>exam_paper_id</w:t>
+            </w:r>
+          </w:p>
+        </w:tc>
+        <w:tc>
+          <w:tcPr>
+            <w:tcW w:w="1701" w:type="dxa"/>
+            <w:tcBorders>
+              <w:top w:val="single" w:sz="2" w:space="0" w:color="70AD47" w:themeColor="accent6"/>
+              <w:left w:val="single" w:sz="2" w:space="0" w:color="70AD47" w:themeColor="accent6"/>
+              <w:bottom w:val="single" w:sz="2" w:space="0" w:color="70AD47" w:themeColor="accent6"/>
+              <w:right w:val="single" w:sz="2" w:space="0" w:color="70AD47" w:themeColor="accent6"/>
+            </w:tcBorders>
+            <w:vAlign w:val="center"/>
+          </w:tcPr>
+          <w:p>
+            <w:pPr>
+              <w:jc w:val="center"/>
+              <w:rPr>
+                <w:rFonts w:ascii="Times New Roman" w:eastAsia="SimSun" w:hAnsi="Times New Roman"/>
+                <w:color w:val="FF0000"/>
+                <w:sz w:val="21"/>
+              </w:rPr>
+            </w:pPr>
+            <w:r>
+              <w:rPr>
+                <w:rFonts w:ascii="Times New Roman" w:eastAsia="SimSun" w:hAnsi="Times New Roman"/>
+                <w:color w:val="FF0000"/>
+                <w:sz w:val="21"/>
+              </w:rPr>
+              <w:t>bigserial</w:t>
+            </w:r>
+          </w:p>
+        </w:tc>
+        <w:tc>
+          <w:tcPr>
+            <w:tcW w:w="2694" w:type="dxa"/>
+            <w:tcBorders>
+              <w:top w:val="single" w:sz="2" w:space="0" w:color="70AD47" w:themeColor="accent6"/>
+              <w:left w:val="single" w:sz="2" w:space="0" w:color="70AD47" w:themeColor="accent6"/>
+              <w:bottom w:val="single" w:sz="2" w:space="0" w:color="70AD47" w:themeColor="accent6"/>
+              <w:right w:val="single" w:sz="2" w:space="0" w:color="70AD47" w:themeColor="accent6"/>
+            </w:tcBorders>
+            <w:vAlign w:val="center"/>
+          </w:tcPr>
+          <w:p>
+            <w:pPr>
+              <w:jc w:val="center"/>
+              <w:rPr>
+                <w:rFonts w:ascii="Times New Roman" w:eastAsia="SimSun" w:hAnsi="Times New Roman"/>
+                <w:color w:val="FF0000"/>
+                <w:sz w:val="21"/>
+              </w:rPr>
+            </w:pPr>
+            <w:r>
+              <w:rPr>
+                <w:rFonts w:ascii="Times New Roman" w:eastAsia="SimSun" w:hAnsi="Times New Roman"/>
+                <w:color w:val="FF0000"/>
+                <w:sz w:val="21"/>
+              </w:rPr>
+              <w:t>NOT NULL, FK</w:t>
+            </w:r>
+          </w:p>
+        </w:tc>
+        <w:tc>
+          <w:tcPr>
+            <w:tcW w:w="2709" w:type="dxa"/>
+            <w:tcBorders>
+              <w:top w:val="single" w:sz="2" w:space="0" w:color="70AD47" w:themeColor="accent6"/>
+              <w:left w:val="single" w:sz="2" w:space="0" w:color="70AD47" w:themeColor="accent6"/>
+              <w:bottom w:val="single" w:sz="2" w:space="0" w:color="70AD47" w:themeColor="accent6"/>
+              <w:right w:val="single" w:sz="2" w:space="0" w:color="70AD47" w:themeColor="accent6"/>
+            </w:tcBorders>
+            <w:vAlign w:val="center"/>
+          </w:tcPr>
+          <w:p>
+            <w:pPr>
+              <w:jc w:val="center"/>
+              <w:rPr>
+                <w:rFonts w:ascii="Times New Roman" w:eastAsia="SimSun" w:hAnsi="Times New Roman"/>
+                <w:color w:val="FF0000"/>
+              </w:rPr>
+            </w:pPr>
+            <w:r>
+              <w:rPr>
+                <w:rFonts w:ascii="Times New Roman" w:eastAsia="SimSun" w:hAnsi="Times New Roman" w:hint="eastAsia"/>
+                <w:color w:val="FF0000"/>
+              </w:rPr>
+              <w:t>考卷编号</w:t>
+            </w:r>
+          </w:p>
+        </w:tc>
+      </w:tr>
+    </w:tbl>
+    <w:p>
+      <w:pPr>
+        <w:rPr>
+          <w:rFonts w:hint="eastAsia"/>
+        </w:rPr>
+      </w:pPr>
+    </w:p>
+    <w:p>
+      <w:pPr>
+        <w:spacing w:after="240" w:line="300" w:lineRule="exact"/>
+        <w:ind w:firstLine="422"/>
+        <w:jc w:val="center"/>
+        <w:rPr>
+          <w:rFonts w:ascii="SimSun" w:eastAsia="SimSun" w:hAnsi="SimSun"/>
+          <w:b/>
+          <w:bCs/>
+          <w:sz w:val="21"/>
+        </w:rPr>
+      </w:pPr>
+      <w:r>
+        <w:rPr>
+          <w:rFonts w:ascii="SimSun" w:eastAsia="SimSun" w:hAnsi="SimSun"/>
+          <w:b/>
+          <w:bCs/>
+          <w:sz w:val="21"/>
+        </w:rPr>
+        <w:t>表3.</w:t>
+      </w:r>
+      <w:r>
+        <w:rPr>
+          <w:rFonts w:ascii="SimSun" w:eastAsia="SimSun" w:hAnsi="SimSun"/>
+          <w:b/>
+          <w:bCs/>
+          <w:sz w:val="21"/>
+        </w:rPr>
+        <w:t>1</w:t>
+      </w:r>
+      <w:r>
+        <w:rPr>
+          <w:rFonts w:ascii="SimSun" w:eastAsia="SimSun" w:hAnsi="SimSun"/>
+          <w:b/>
+          <w:bCs/>
+          <w:sz w:val="21"/>
+        </w:rPr>
+        <w:t>1</w:t>
+      </w:r>
+      <w:r>
+        <w:rPr>
+          <w:rFonts w:ascii="SimSun" w:eastAsia="SimSun" w:hAnsi="SimSun"/>
+          <w:b/>
+          <w:bCs/>
+          <w:sz w:val="21"/>
+        </w:rPr>
+        <w:t xml:space="preserve"> (</w:t>
+      </w:r>
+      <w:r>
+        <w:rPr>
+          <w:rFonts w:ascii="SimSun" w:eastAsia="SimSun" w:hAnsi="SimSun"/>
+          <w:b/>
+          <w:bCs/>
+          <w:sz w:val="21"/>
+        </w:rPr>
+        <w:t>exa</w:t>
+      </w:r>
+      <w:r>
+        <w:rPr>
+          <w:rFonts w:ascii="SimSun" w:eastAsia="SimSun" w:hAnsi="SimSun" w:hint="eastAsia"/>
+          <w:b/>
+          <w:bCs/>
+          <w:sz w:val="21"/>
+        </w:rPr>
+        <w:t>m</w:t>
+      </w:r>
+      <w:r>
+        <w:rPr>
+          <w:rFonts w:ascii="SimSun" w:eastAsia="SimSun" w:hAnsi="SimSun"/>
+          <w:b/>
+          <w:bCs/>
+          <w:sz w:val="21"/>
+        </w:rPr>
+        <w:t>_paper</w:t>
+      </w:r>
+      <w:r>
+        <w:rPr>
+          <w:rFonts w:ascii="SimSun" w:eastAsia="SimSun" w:hAnsi="SimSun"/>
+          <w:b/>
+          <w:bCs/>
+          <w:sz w:val="21"/>
+        </w:rPr>
+        <w:t>)</w:t>
+      </w:r>
+    </w:p>
+    <w:tbl>
+      <w:tblPr>
+        <w:tblW w:w="9357" w:type="dxa"/>
+        <w:tblBorders>
+          <w:top w:val="single" w:sz="12" w:space="0" w:color="auto"/>
+          <w:left w:val="single" w:sz="12" w:space="0" w:color="E7E6E6"/>
+          <w:bottom w:val="single" w:sz="12" w:space="0" w:color="auto"/>
+          <w:right w:val="single" w:sz="12" w:space="0" w:color="E7E6E6"/>
+          <w:insideH w:val="single" w:sz="12" w:space="0" w:color="auto"/>
+          <w:insideV w:val="single" w:sz="12" w:space="0" w:color="E7E6E6"/>
+        </w:tblBorders>
+        <w:tblLayout w:type="fixed"/>
+        <w:tblLook w:val="0000" w:firstRow="0" w:lastRow="0" w:firstColumn="0" w:lastColumn="0" w:noHBand="0" w:noVBand="0"/>
+      </w:tblPr>
+      <w:tblGrid>
+        <w:gridCol w:w="2253"/>
+        <w:gridCol w:w="1701"/>
+        <w:gridCol w:w="2694"/>
+        <w:gridCol w:w="2709"/>
+      </w:tblGrid>
+      <w:tr>
+        <w:tc>
+          <w:tcPr>
+            <w:tcW w:w="2253" w:type="dxa"/>
+            <w:tcBorders>
+              <w:top w:val="single" w:sz="12" w:space="0" w:color="70AD47" w:themeColor="accent6"/>
+              <w:left w:val="single" w:sz="2" w:space="0" w:color="70AD47" w:themeColor="accent6"/>
+              <w:bottom w:val="single" w:sz="12" w:space="0" w:color="70AD47" w:themeColor="accent6"/>
+              <w:right w:val="single" w:sz="2" w:space="0" w:color="70AD47" w:themeColor="accent6"/>
+            </w:tcBorders>
+            <w:vAlign w:val="center"/>
+          </w:tcPr>
+          <w:p>
+            <w:pPr>
+              <w:spacing w:after="240" w:line="300" w:lineRule="exact"/>
+              <w:ind w:firstLine="422"/>
+              <w:jc w:val="center"/>
+              <w:rPr>
+                <w:rFonts w:ascii="SimSun" w:eastAsia="SimSun" w:hAnsi="SimSun"/>
+                <w:b/>
+                <w:bCs/>
+                <w:sz w:val="21"/>
+              </w:rPr>
+            </w:pPr>
+            <w:r>
+              <w:rPr>
+                <w:rFonts w:ascii="SimSun" w:eastAsia="SimSun" w:hAnsi="SimSun"/>
+                <w:b/>
+                <w:bCs/>
+                <w:sz w:val="21"/>
+              </w:rPr>
+              <w:t>字段名称</w:t>
+            </w:r>
+          </w:p>
+        </w:tc>
+        <w:tc>
+          <w:tcPr>
+            <w:tcW w:w="1701" w:type="dxa"/>
+            <w:tcBorders>
+              <w:top w:val="single" w:sz="12" w:space="0" w:color="70AD47" w:themeColor="accent6"/>
+              <w:left w:val="single" w:sz="2" w:space="0" w:color="70AD47" w:themeColor="accent6"/>
+              <w:bottom w:val="single" w:sz="12" w:space="0" w:color="70AD47" w:themeColor="accent6"/>
+              <w:right w:val="single" w:sz="2" w:space="0" w:color="70AD47" w:themeColor="accent6"/>
+            </w:tcBorders>
+            <w:vAlign w:val="center"/>
+          </w:tcPr>
+          <w:p>
+            <w:pPr>
+              <w:spacing w:after="240" w:line="300" w:lineRule="exact"/>
+              <w:ind w:firstLine="422"/>
+              <w:jc w:val="center"/>
+              <w:rPr>
+                <w:rFonts w:ascii="SimSun" w:eastAsia="SimSun" w:hAnsi="SimSun"/>
+                <w:b/>
+                <w:bCs/>
+                <w:sz w:val="21"/>
+              </w:rPr>
+            </w:pPr>
+            <w:r>
+              <w:rPr>
+                <w:rFonts w:ascii="SimSun" w:eastAsia="SimSun" w:hAnsi="SimSun"/>
+                <w:b/>
+                <w:bCs/>
+                <w:sz w:val="21"/>
+              </w:rPr>
+              <w:t>类型宽度</w:t>
+            </w:r>
+          </w:p>
+        </w:tc>
+        <w:tc>
+          <w:tcPr>
+            <w:tcW w:w="2694" w:type="dxa"/>
+            <w:tcBorders>
+              <w:top w:val="single" w:sz="12" w:space="0" w:color="70AD47" w:themeColor="accent6"/>
+              <w:left w:val="single" w:sz="2" w:space="0" w:color="70AD47" w:themeColor="accent6"/>
+              <w:bottom w:val="single" w:sz="12" w:space="0" w:color="70AD47" w:themeColor="accent6"/>
+              <w:right w:val="single" w:sz="2" w:space="0" w:color="70AD47" w:themeColor="accent6"/>
+            </w:tcBorders>
+            <w:vAlign w:val="center"/>
+          </w:tcPr>
+          <w:p>
+            <w:pPr>
+              <w:spacing w:after="240" w:line="300" w:lineRule="exact"/>
+              <w:ind w:firstLine="422"/>
+              <w:jc w:val="center"/>
+              <w:rPr>
+                <w:rFonts w:ascii="SimSun" w:eastAsia="SimSun" w:hAnsi="SimSun"/>
+                <w:b/>
+                <w:bCs/>
+                <w:sz w:val="21"/>
+              </w:rPr>
+            </w:pPr>
+            <w:r>
+              <w:rPr>
+                <w:rFonts w:ascii="SimSun" w:eastAsia="SimSun" w:hAnsi="SimSun"/>
+                <w:b/>
+                <w:bCs/>
+                <w:sz w:val="21"/>
+              </w:rPr>
+              <w:t>约束说明</w:t>
+            </w:r>
+          </w:p>
+        </w:tc>
+        <w:tc>
+          <w:tcPr>
+            <w:tcW w:w="2709" w:type="dxa"/>
+            <w:tcBorders>
+              <w:top w:val="single" w:sz="12" w:space="0" w:color="70AD47" w:themeColor="accent6"/>
+              <w:left w:val="single" w:sz="2" w:space="0" w:color="70AD47" w:themeColor="accent6"/>
+              <w:bottom w:val="single" w:sz="12" w:space="0" w:color="70AD47" w:themeColor="accent6"/>
+              <w:right w:val="single" w:sz="2" w:space="0" w:color="70AD47" w:themeColor="accent6"/>
+            </w:tcBorders>
+            <w:vAlign w:val="center"/>
+          </w:tcPr>
+          <w:p>
+            <w:pPr>
+              <w:spacing w:after="240" w:line="300" w:lineRule="exact"/>
+              <w:ind w:firstLine="422"/>
+              <w:jc w:val="center"/>
+              <w:rPr>
+                <w:rFonts w:ascii="SimSun" w:eastAsia="SimSun" w:hAnsi="SimSun"/>
+                <w:b/>
+                <w:bCs/>
+                <w:sz w:val="21"/>
+              </w:rPr>
+            </w:pPr>
+            <w:r>
+              <w:rPr>
+                <w:rFonts w:ascii="SimSun" w:eastAsia="SimSun" w:hAnsi="SimSun"/>
+                <w:b/>
+                <w:bCs/>
+                <w:sz w:val="21"/>
+              </w:rPr>
+              <w:t>功能说明</w:t>
+            </w:r>
+          </w:p>
+        </w:tc>
+      </w:tr>
+      <w:tr>
+        <w:tc>
+          <w:tcPr>
+            <w:tcW w:w="2253" w:type="dxa"/>
+            <w:tcBorders>
+              <w:top w:val="single" w:sz="12" w:space="0" w:color="70AD47" w:themeColor="accent6"/>
+              <w:left w:val="single" w:sz="2" w:space="0" w:color="70AD47" w:themeColor="accent6"/>
+              <w:bottom w:val="single" w:sz="2" w:space="0" w:color="70AD47" w:themeColor="accent6"/>
+              <w:right w:val="single" w:sz="2" w:space="0" w:color="70AD47" w:themeColor="accent6"/>
+            </w:tcBorders>
+            <w:vAlign w:val="center"/>
+          </w:tcPr>
+          <w:p>
+            <w:pPr>
+              <w:jc w:val="center"/>
+              <w:rPr>
+                <w:rFonts w:ascii="Times New Roman" w:eastAsia="SimSun" w:hAnsi="Times New Roman"/>
+                <w:color w:val="0070C0"/>
+                <w:sz w:val="21"/>
+              </w:rPr>
+            </w:pPr>
+            <w:r>
+              <w:rPr>
+                <w:rFonts w:ascii="Times New Roman" w:eastAsia="SimSun" w:hAnsi="Times New Roman"/>
+                <w:color w:val="0070C0"/>
+                <w:sz w:val="21"/>
+              </w:rPr>
+              <w:t>id</w:t>
+            </w:r>
+          </w:p>
+        </w:tc>
+        <w:tc>
+          <w:tcPr>
+            <w:tcW w:w="1701" w:type="dxa"/>
+            <w:tcBorders>
+              <w:top w:val="single" w:sz="12" w:space="0" w:color="70AD47" w:themeColor="accent6"/>
+              <w:left w:val="single" w:sz="2" w:space="0" w:color="70AD47" w:themeColor="accent6"/>
+              <w:bottom w:val="single" w:sz="2" w:space="0" w:color="70AD47" w:themeColor="accent6"/>
+              <w:right w:val="single" w:sz="2" w:space="0" w:color="70AD47" w:themeColor="accent6"/>
+            </w:tcBorders>
+            <w:vAlign w:val="center"/>
+          </w:tcPr>
+          <w:p>
+            <w:pPr>
+              <w:jc w:val="center"/>
+              <w:rPr>
+                <w:rFonts w:ascii="Times New Roman" w:eastAsia="SimSun" w:hAnsi="Times New Roman"/>
+                <w:color w:val="0070C0"/>
+                <w:sz w:val="21"/>
+              </w:rPr>
+            </w:pPr>
+            <w:r>
+              <w:rPr>
+                <w:rFonts w:ascii="Times New Roman" w:eastAsia="SimSun" w:hAnsi="Times New Roman"/>
+                <w:color w:val="0070C0"/>
+                <w:sz w:val="21"/>
+              </w:rPr>
+              <w:t>bigserial</w:t>
+            </w:r>
+          </w:p>
+        </w:tc>
+        <w:tc>
+          <w:tcPr>
+            <w:tcW w:w="2694" w:type="dxa"/>
+            <w:tcBorders>
+              <w:top w:val="single" w:sz="12" w:space="0" w:color="70AD47" w:themeColor="accent6"/>
+              <w:left w:val="single" w:sz="2" w:space="0" w:color="70AD47" w:themeColor="accent6"/>
+              <w:bottom w:val="single" w:sz="2" w:space="0" w:color="70AD47" w:themeColor="accent6"/>
+              <w:right w:val="single" w:sz="2" w:space="0" w:color="70AD47" w:themeColor="accent6"/>
+            </w:tcBorders>
+            <w:vAlign w:val="center"/>
+          </w:tcPr>
+          <w:p>
+            <w:pPr>
+              <w:jc w:val="center"/>
+              <w:rPr>
+                <w:rFonts w:ascii="Times New Roman" w:eastAsia="SimSun" w:hAnsi="Times New Roman"/>
+                <w:color w:val="0070C0"/>
+                <w:sz w:val="21"/>
+              </w:rPr>
+            </w:pPr>
+            <w:r>
+              <w:rPr>
+                <w:rFonts w:ascii="Times New Roman" w:eastAsia="SimSun" w:hAnsi="Times New Roman"/>
+                <w:color w:val="0070C0"/>
+                <w:sz w:val="21"/>
+              </w:rPr>
+              <w:t>KEY, NOT NULL</w:t>
+            </w:r>
+          </w:p>
+        </w:tc>
+        <w:tc>
+          <w:tcPr>
+            <w:tcW w:w="2709" w:type="dxa"/>
+            <w:tcBorders>
+              <w:top w:val="single" w:sz="12" w:space="0" w:color="70AD47" w:themeColor="accent6"/>
+              <w:left w:val="single" w:sz="2" w:space="0" w:color="70AD47" w:themeColor="accent6"/>
+              <w:bottom w:val="single" w:sz="2" w:space="0" w:color="70AD47" w:themeColor="accent6"/>
+              <w:right w:val="single" w:sz="2" w:space="0" w:color="70AD47" w:themeColor="accent6"/>
+            </w:tcBorders>
+            <w:vAlign w:val="center"/>
+          </w:tcPr>
+          <w:p>
+            <w:pPr>
+              <w:jc w:val="center"/>
+              <w:rPr>
+                <w:rFonts w:ascii="Times New Roman" w:eastAsia="SimSun" w:hAnsi="Times New Roman"/>
+                <w:color w:val="0070C0"/>
+                <w:sz w:val="21"/>
+              </w:rPr>
+            </w:pPr>
+            <w:r>
+              <w:rPr>
+                <w:rFonts w:ascii="Times New Roman" w:eastAsia="SimSun" w:hAnsi="Times New Roman" w:hint="eastAsia"/>
+                <w:color w:val="0070C0"/>
+              </w:rPr>
+              <w:t>考</w:t>
+            </w:r>
+            <w:r>
+              <w:rPr>
+                <w:rFonts w:ascii="Times New Roman" w:eastAsia="SimSun" w:hAnsi="Times New Roman" w:hint="eastAsia"/>
+                <w:color w:val="0070C0"/>
+              </w:rPr>
+              <w:t>卷</w:t>
+            </w:r>
+            <w:r>
+              <w:rPr>
+                <w:rFonts w:ascii="Times New Roman" w:eastAsia="SimSun" w:hAnsi="Times New Roman"/>
+                <w:color w:val="0070C0"/>
+              </w:rPr>
+              <w:t>唯一编号</w:t>
+            </w:r>
+          </w:p>
+        </w:tc>
+      </w:tr>
+      <w:tr>
+        <w:tc>
+          <w:tcPr>
+            <w:tcW w:w="2253" w:type="dxa"/>
+            <w:tcBorders>
+              <w:top w:val="single" w:sz="2" w:space="0" w:color="70AD47" w:themeColor="accent6"/>
+              <w:left w:val="single" w:sz="2" w:space="0" w:color="70AD47" w:themeColor="accent6"/>
+              <w:bottom w:val="single" w:sz="2" w:space="0" w:color="70AD47" w:themeColor="accent6"/>
+              <w:right w:val="single" w:sz="2" w:space="0" w:color="70AD47" w:themeColor="accent6"/>
+            </w:tcBorders>
+            <w:vAlign w:val="center"/>
+          </w:tcPr>
+          <w:p>
+            <w:pPr>
+              <w:jc w:val="center"/>
+              <w:rPr>
+                <w:rFonts w:ascii="Times New Roman" w:eastAsia="SimSun" w:hAnsi="Times New Roman"/>
+                <w:sz w:val="21"/>
+              </w:rPr>
+            </w:pPr>
+            <w:r>
+              <w:rPr>
+                <w:rFonts w:ascii="Times New Roman" w:eastAsia="SimSun" w:hAnsi="Times New Roman"/>
+                <w:sz w:val="21"/>
+              </w:rPr>
+              <w:t xml:space="preserve"> </w:t>
+            </w:r>
+            <w:r>
+              <w:rPr>
+                <w:rFonts w:ascii="Times New Roman" w:eastAsia="SimSun" w:hAnsi="Times New Roman"/>
+                <w:sz w:val="21"/>
+              </w:rPr>
+              <w:t>exam_paper_type</w:t>
+            </w:r>
+          </w:p>
+        </w:tc>
+        <w:tc>
+          <w:tcPr>
+            <w:tcW w:w="1701" w:type="dxa"/>
+            <w:tcBorders>
+              <w:top w:val="single" w:sz="2" w:space="0" w:color="70AD47" w:themeColor="accent6"/>
+              <w:left w:val="single" w:sz="2" w:space="0" w:color="70AD47" w:themeColor="accent6"/>
+              <w:bottom w:val="single" w:sz="2" w:space="0" w:color="70AD47" w:themeColor="accent6"/>
+              <w:right w:val="single" w:sz="2" w:space="0" w:color="70AD47" w:themeColor="accent6"/>
+            </w:tcBorders>
+            <w:vAlign w:val="center"/>
+          </w:tcPr>
+          <w:p>
+            <w:pPr>
+              <w:jc w:val="center"/>
+              <w:rPr>
+                <w:rFonts w:ascii="Times New Roman" w:eastAsia="SimSun" w:hAnsi="Times New Roman"/>
+                <w:sz w:val="21"/>
+              </w:rPr>
+            </w:pPr>
+            <w:r>
+              <w:rPr>
+                <w:rFonts w:ascii="Times New Roman" w:eastAsia="SimSun" w:hAnsi="Times New Roman"/>
+                <w:sz w:val="21"/>
+              </w:rPr>
+              <w:t>varchar(50)</w:t>
+            </w:r>
+          </w:p>
+        </w:tc>
+        <w:tc>
+          <w:tcPr>
+            <w:tcW w:w="2694" w:type="dxa"/>
+            <w:tcBorders>
+              <w:top w:val="single" w:sz="2" w:space="0" w:color="70AD47" w:themeColor="accent6"/>
+              <w:left w:val="single" w:sz="2" w:space="0" w:color="70AD47" w:themeColor="accent6"/>
+              <w:bottom w:val="single" w:sz="2" w:space="0" w:color="70AD47" w:themeColor="accent6"/>
+              <w:right w:val="single" w:sz="2" w:space="0" w:color="70AD47" w:themeColor="accent6"/>
+            </w:tcBorders>
+            <w:vAlign w:val="center"/>
+          </w:tcPr>
+          <w:p>
+            <w:pPr>
+              <w:jc w:val="center"/>
+              <w:rPr>
+                <w:rFonts w:ascii="Times New Roman" w:eastAsia="SimSun" w:hAnsi="Times New Roman"/>
+                <w:sz w:val="21"/>
+              </w:rPr>
+            </w:pPr>
+            <w:r>
+              <w:rPr>
+                <w:rFonts w:ascii="Times New Roman" w:eastAsia="SimSun" w:hAnsi="Times New Roman"/>
+                <w:sz w:val="21"/>
+              </w:rPr>
+              <w:t>NOT NULL</w:t>
+            </w:r>
+          </w:p>
+        </w:tc>
+        <w:tc>
+          <w:tcPr>
+            <w:tcW w:w="2709" w:type="dxa"/>
+            <w:tcBorders>
+              <w:top w:val="single" w:sz="2" w:space="0" w:color="70AD47" w:themeColor="accent6"/>
+              <w:left w:val="single" w:sz="2" w:space="0" w:color="70AD47" w:themeColor="accent6"/>
+              <w:bottom w:val="single" w:sz="2" w:space="0" w:color="70AD47" w:themeColor="accent6"/>
+              <w:right w:val="single" w:sz="2" w:space="0" w:color="70AD47" w:themeColor="accent6"/>
+            </w:tcBorders>
+            <w:vAlign w:val="center"/>
+          </w:tcPr>
+          <w:p>
+            <w:pPr>
+              <w:jc w:val="center"/>
+              <w:rPr>
+                <w:rFonts w:ascii="Times New Roman" w:eastAsia="SimSun" w:hAnsi="Times New Roman"/>
+                <w:sz w:val="21"/>
+              </w:rPr>
+            </w:pPr>
+            <w:r>
+              <w:rPr>
+                <w:rFonts w:ascii="Times New Roman" w:eastAsia="SimSun" w:hAnsi="Times New Roman" w:hint="eastAsia"/>
+                <w:sz w:val="21"/>
+              </w:rPr>
+              <w:t>考卷类别</w:t>
+            </w:r>
+          </w:p>
+          <w:p>
+            <w:pPr>
+              <w:jc w:val="center"/>
+              <w:rPr>
+                <w:rFonts w:ascii="Times New Roman" w:eastAsia="SimSun" w:hAnsi="Times New Roman" w:hint="eastAsia"/>
+                <w:sz w:val="21"/>
+              </w:rPr>
+            </w:pPr>
+            <w:r>
+              <w:rPr>
+                <w:rFonts w:ascii="Times New Roman" w:eastAsia="SimSun" w:hAnsi="Times New Roman"/>
+                <w:sz w:val="21"/>
+              </w:rPr>
+              <w:t>(MANUAL, AUTO)</w:t>
+            </w:r>
+          </w:p>
+        </w:tc>
+      </w:tr>
+      <w:tr>
+        <w:tc>
+          <w:tcPr>
+            <w:tcW w:w="2253" w:type="dxa"/>
+            <w:tcBorders>
+              <w:top w:val="single" w:sz="2" w:space="0" w:color="70AD47" w:themeColor="accent6"/>
+              <w:left w:val="single" w:sz="2" w:space="0" w:color="70AD47" w:themeColor="accent6"/>
+              <w:bottom w:val="single" w:sz="2" w:space="0" w:color="70AD47" w:themeColor="accent6"/>
+              <w:right w:val="single" w:sz="2" w:space="0" w:color="70AD47" w:themeColor="accent6"/>
+            </w:tcBorders>
+            <w:vAlign w:val="center"/>
+          </w:tcPr>
+          <w:p>
+            <w:pPr>
+              <w:jc w:val="center"/>
+              <w:rPr>
+                <w:rFonts w:ascii="Times New Roman" w:eastAsia="SimSun" w:hAnsi="Times New Roman"/>
+                <w:sz w:val="21"/>
+              </w:rPr>
+            </w:pPr>
+            <w:r>
+              <w:rPr>
+                <w:rFonts w:ascii="Times New Roman" w:eastAsia="SimSun" w:hAnsi="Times New Roman" w:hint="eastAsia"/>
+                <w:sz w:val="21"/>
+              </w:rPr>
+              <w:t>easy</w:t>
+            </w:r>
+            <w:r>
+              <w:rPr>
+                <w:rFonts w:ascii="Times New Roman" w:eastAsia="SimSun" w:hAnsi="Times New Roman"/>
+                <w:sz w:val="21"/>
+              </w:rPr>
+              <w:t>_question</w:t>
+            </w:r>
+          </w:p>
+        </w:tc>
+        <w:tc>
+          <w:tcPr>
+            <w:tcW w:w="1701" w:type="dxa"/>
+            <w:tcBorders>
+              <w:top w:val="single" w:sz="2" w:space="0" w:color="70AD47" w:themeColor="accent6"/>
+              <w:left w:val="single" w:sz="2" w:space="0" w:color="70AD47" w:themeColor="accent6"/>
+              <w:bottom w:val="single" w:sz="2" w:space="0" w:color="70AD47" w:themeColor="accent6"/>
+              <w:right w:val="single" w:sz="2" w:space="0" w:color="70AD47" w:themeColor="accent6"/>
+            </w:tcBorders>
+            <w:vAlign w:val="center"/>
+          </w:tcPr>
+          <w:p>
+            <w:pPr>
+              <w:jc w:val="center"/>
+              <w:rPr>
+                <w:rFonts w:ascii="Times New Roman" w:eastAsia="SimSun" w:hAnsi="Times New Roman"/>
+                <w:sz w:val="21"/>
+              </w:rPr>
+            </w:pPr>
+            <w:r>
+              <w:rPr>
+                <w:rFonts w:ascii="Times New Roman" w:eastAsia="SimSun" w:hAnsi="Times New Roman"/>
+                <w:sz w:val="21"/>
+              </w:rPr>
+              <w:t>int</w:t>
+            </w:r>
+          </w:p>
+        </w:tc>
+        <w:tc>
+          <w:tcPr>
+            <w:tcW w:w="2694" w:type="dxa"/>
+            <w:tcBorders>
+              <w:top w:val="single" w:sz="2" w:space="0" w:color="70AD47" w:themeColor="accent6"/>
+              <w:left w:val="single" w:sz="2" w:space="0" w:color="70AD47" w:themeColor="accent6"/>
+              <w:bottom w:val="single" w:sz="2" w:space="0" w:color="70AD47" w:themeColor="accent6"/>
+              <w:right w:val="single" w:sz="2" w:space="0" w:color="70AD47" w:themeColor="accent6"/>
+            </w:tcBorders>
+            <w:vAlign w:val="center"/>
+          </w:tcPr>
+          <w:p>
+            <w:pPr>
+              <w:jc w:val="center"/>
+              <w:rPr>
+                <w:rFonts w:ascii="Times New Roman" w:eastAsia="SimSun" w:hAnsi="Times New Roman"/>
+                <w:sz w:val="21"/>
+              </w:rPr>
+            </w:pPr>
+            <w:r>
+              <w:rPr>
+                <w:rFonts w:ascii="Times New Roman" w:eastAsia="SimSun" w:hAnsi="Times New Roman" w:hint="eastAsia"/>
+                <w:sz w:val="21"/>
+              </w:rPr>
+              <w:t>无</w:t>
+            </w:r>
+          </w:p>
+        </w:tc>
+        <w:tc>
+          <w:tcPr>
+            <w:tcW w:w="2709" w:type="dxa"/>
+            <w:tcBorders>
+              <w:top w:val="single" w:sz="2" w:space="0" w:color="70AD47" w:themeColor="accent6"/>
+              <w:left w:val="single" w:sz="2" w:space="0" w:color="70AD47" w:themeColor="accent6"/>
+              <w:bottom w:val="single" w:sz="2" w:space="0" w:color="70AD47" w:themeColor="accent6"/>
+              <w:right w:val="single" w:sz="2" w:space="0" w:color="70AD47" w:themeColor="accent6"/>
+            </w:tcBorders>
+            <w:vAlign w:val="center"/>
+          </w:tcPr>
+          <w:p>
+            <w:pPr>
+              <w:jc w:val="center"/>
+              <w:rPr>
+                <w:rFonts w:ascii="Times New Roman" w:eastAsia="SimSun" w:hAnsi="Times New Roman"/>
+              </w:rPr>
+            </w:pPr>
+            <w:r>
+              <w:rPr>
+                <w:rFonts w:ascii="Times New Roman" w:eastAsia="SimSun" w:hAnsi="Times New Roman" w:hint="eastAsia"/>
+                <w:sz w:val="21"/>
+              </w:rPr>
+              <w:t>自动</w:t>
+            </w:r>
+            <w:r>
+              <w:rPr>
+                <w:rFonts w:ascii="Times New Roman" w:eastAsia="SimSun" w:hAnsi="Times New Roman" w:hint="eastAsia"/>
+                <w:sz w:val="21"/>
+              </w:rPr>
+              <w:t>考卷</w:t>
+            </w:r>
+            <w:r>
+              <w:rPr>
+                <w:rFonts w:ascii="Times New Roman" w:eastAsia="SimSun" w:hAnsi="Times New Roman" w:hint="eastAsia"/>
+                <w:sz w:val="21"/>
+              </w:rPr>
+              <w:t>所需简单题</w:t>
+            </w:r>
+          </w:p>
+        </w:tc>
+      </w:tr>
+      <w:tr>
+        <w:tc>
+          <w:tcPr>
+            <w:tcW w:w="2253" w:type="dxa"/>
+            <w:tcBorders>
+              <w:top w:val="single" w:sz="2" w:space="0" w:color="70AD47" w:themeColor="accent6"/>
+              <w:left w:val="single" w:sz="2" w:space="0" w:color="70AD47" w:themeColor="accent6"/>
+              <w:bottom w:val="single" w:sz="2" w:space="0" w:color="70AD47" w:themeColor="accent6"/>
+              <w:right w:val="single" w:sz="2" w:space="0" w:color="70AD47" w:themeColor="accent6"/>
+            </w:tcBorders>
+            <w:vAlign w:val="center"/>
+          </w:tcPr>
+          <w:p>
+            <w:pPr>
+              <w:jc w:val="center"/>
+              <w:rPr>
+                <w:rFonts w:ascii="Times New Roman" w:eastAsia="SimSun" w:hAnsi="Times New Roman"/>
+                <w:sz w:val="21"/>
+              </w:rPr>
+            </w:pPr>
+            <w:r>
+              <w:rPr>
+                <w:rFonts w:ascii="Times New Roman" w:eastAsia="SimSun" w:hAnsi="Times New Roman"/>
+                <w:sz w:val="21"/>
+              </w:rPr>
+              <w:lastRenderedPageBreak/>
+              <w:t>medium_question</w:t>
+            </w:r>
+          </w:p>
+        </w:tc>
+        <w:tc>
+          <w:tcPr>
+            <w:tcW w:w="1701" w:type="dxa"/>
+            <w:tcBorders>
+              <w:top w:val="single" w:sz="2" w:space="0" w:color="70AD47" w:themeColor="accent6"/>
+              <w:left w:val="single" w:sz="2" w:space="0" w:color="70AD47" w:themeColor="accent6"/>
+              <w:bottom w:val="single" w:sz="2" w:space="0" w:color="70AD47" w:themeColor="accent6"/>
+              <w:right w:val="single" w:sz="2" w:space="0" w:color="70AD47" w:themeColor="accent6"/>
+            </w:tcBorders>
+            <w:vAlign w:val="center"/>
+          </w:tcPr>
+          <w:p>
+            <w:pPr>
+              <w:jc w:val="center"/>
+              <w:rPr>
+                <w:rFonts w:ascii="Times New Roman" w:eastAsia="SimSun" w:hAnsi="Times New Roman"/>
+                <w:sz w:val="21"/>
+              </w:rPr>
+            </w:pPr>
+            <w:r>
+              <w:rPr>
+                <w:rFonts w:ascii="Times New Roman" w:eastAsia="SimSun" w:hAnsi="Times New Roman"/>
+                <w:sz w:val="21"/>
+              </w:rPr>
+              <w:t>int</w:t>
+            </w:r>
+          </w:p>
+        </w:tc>
+        <w:tc>
+          <w:tcPr>
+            <w:tcW w:w="2694" w:type="dxa"/>
+            <w:tcBorders>
+              <w:top w:val="single" w:sz="2" w:space="0" w:color="70AD47" w:themeColor="accent6"/>
+              <w:left w:val="single" w:sz="2" w:space="0" w:color="70AD47" w:themeColor="accent6"/>
+              <w:bottom w:val="single" w:sz="2" w:space="0" w:color="70AD47" w:themeColor="accent6"/>
+              <w:right w:val="single" w:sz="2" w:space="0" w:color="70AD47" w:themeColor="accent6"/>
+            </w:tcBorders>
+            <w:vAlign w:val="center"/>
+          </w:tcPr>
+          <w:p>
+            <w:pPr>
+              <w:jc w:val="center"/>
+              <w:rPr>
+                <w:rFonts w:ascii="Times New Roman" w:eastAsia="SimSun" w:hAnsi="Times New Roman"/>
+                <w:sz w:val="21"/>
+              </w:rPr>
+            </w:pPr>
+            <w:r>
+              <w:rPr>
+                <w:rFonts w:ascii="Times New Roman" w:eastAsia="SimSun" w:hAnsi="Times New Roman" w:hint="eastAsia"/>
+                <w:sz w:val="21"/>
+              </w:rPr>
+              <w:t>无</w:t>
+            </w:r>
+          </w:p>
+        </w:tc>
+        <w:tc>
+          <w:tcPr>
+            <w:tcW w:w="2709" w:type="dxa"/>
+            <w:tcBorders>
+              <w:top w:val="single" w:sz="2" w:space="0" w:color="70AD47" w:themeColor="accent6"/>
+              <w:left w:val="single" w:sz="2" w:space="0" w:color="70AD47" w:themeColor="accent6"/>
+              <w:bottom w:val="single" w:sz="2" w:space="0" w:color="70AD47" w:themeColor="accent6"/>
+              <w:right w:val="single" w:sz="2" w:space="0" w:color="70AD47" w:themeColor="accent6"/>
+            </w:tcBorders>
+            <w:vAlign w:val="center"/>
+          </w:tcPr>
+          <w:p>
+            <w:pPr>
+              <w:jc w:val="center"/>
+              <w:rPr>
+                <w:rFonts w:ascii="Times New Roman" w:eastAsia="SimSun" w:hAnsi="Times New Roman"/>
+              </w:rPr>
+            </w:pPr>
+            <w:r>
+              <w:rPr>
+                <w:rFonts w:ascii="Times New Roman" w:eastAsia="SimSun" w:hAnsi="Times New Roman" w:hint="eastAsia"/>
+                <w:sz w:val="21"/>
+              </w:rPr>
+              <w:t>自动考卷所需题</w:t>
+            </w:r>
+          </w:p>
+        </w:tc>
+      </w:tr>
+      <w:tr>
+        <w:tc>
+          <w:tcPr>
+            <w:tcW w:w="2253" w:type="dxa"/>
+            <w:tcBorders>
+              <w:top w:val="single" w:sz="2" w:space="0" w:color="70AD47" w:themeColor="accent6"/>
+              <w:left w:val="single" w:sz="2" w:space="0" w:color="70AD47" w:themeColor="accent6"/>
+              <w:bottom w:val="single" w:sz="2" w:space="0" w:color="70AD47" w:themeColor="accent6"/>
+              <w:right w:val="single" w:sz="2" w:space="0" w:color="70AD47" w:themeColor="accent6"/>
+            </w:tcBorders>
+            <w:vAlign w:val="center"/>
+          </w:tcPr>
+          <w:p>
+            <w:pPr>
+              <w:jc w:val="center"/>
+              <w:rPr>
+                <w:rFonts w:ascii="Times New Roman" w:eastAsia="SimSun" w:hAnsi="Times New Roman"/>
+                <w:sz w:val="21"/>
+              </w:rPr>
+            </w:pPr>
+            <w:r>
+              <w:rPr>
+                <w:rFonts w:ascii="Times New Roman" w:eastAsia="SimSun" w:hAnsi="Times New Roman"/>
+                <w:sz w:val="21"/>
+              </w:rPr>
+              <w:t>hard_question</w:t>
+            </w:r>
+          </w:p>
+        </w:tc>
+        <w:tc>
+          <w:tcPr>
+            <w:tcW w:w="1701" w:type="dxa"/>
+            <w:tcBorders>
+              <w:top w:val="single" w:sz="2" w:space="0" w:color="70AD47" w:themeColor="accent6"/>
+              <w:left w:val="single" w:sz="2" w:space="0" w:color="70AD47" w:themeColor="accent6"/>
+              <w:bottom w:val="single" w:sz="2" w:space="0" w:color="70AD47" w:themeColor="accent6"/>
+              <w:right w:val="single" w:sz="2" w:space="0" w:color="70AD47" w:themeColor="accent6"/>
+            </w:tcBorders>
+            <w:vAlign w:val="center"/>
+          </w:tcPr>
+          <w:p>
+            <w:pPr>
+              <w:jc w:val="center"/>
+              <w:rPr>
+                <w:rFonts w:ascii="Times New Roman" w:eastAsia="SimSun" w:hAnsi="Times New Roman"/>
+                <w:sz w:val="21"/>
+              </w:rPr>
+            </w:pPr>
+            <w:r>
+              <w:rPr>
+                <w:rFonts w:ascii="Times New Roman" w:eastAsia="SimSun" w:hAnsi="Times New Roman"/>
+                <w:sz w:val="21"/>
+              </w:rPr>
+              <w:t>int</w:t>
+            </w:r>
+          </w:p>
+        </w:tc>
+        <w:tc>
+          <w:tcPr>
+            <w:tcW w:w="2694" w:type="dxa"/>
+            <w:tcBorders>
+              <w:top w:val="single" w:sz="2" w:space="0" w:color="70AD47" w:themeColor="accent6"/>
+              <w:left w:val="single" w:sz="2" w:space="0" w:color="70AD47" w:themeColor="accent6"/>
+              <w:bottom w:val="single" w:sz="2" w:space="0" w:color="70AD47" w:themeColor="accent6"/>
+              <w:right w:val="single" w:sz="2" w:space="0" w:color="70AD47" w:themeColor="accent6"/>
+            </w:tcBorders>
+            <w:vAlign w:val="center"/>
+          </w:tcPr>
+          <w:p>
+            <w:pPr>
+              <w:jc w:val="center"/>
+              <w:rPr>
+                <w:rFonts w:ascii="Times New Roman" w:eastAsia="SimSun" w:hAnsi="Times New Roman"/>
+                <w:sz w:val="21"/>
+              </w:rPr>
+            </w:pPr>
+            <w:r>
+              <w:rPr>
+                <w:rFonts w:ascii="Times New Roman" w:eastAsia="SimSun" w:hAnsi="Times New Roman" w:hint="eastAsia"/>
+                <w:sz w:val="21"/>
+              </w:rPr>
+              <w:t>无</w:t>
+            </w:r>
+          </w:p>
+        </w:tc>
+        <w:tc>
+          <w:tcPr>
+            <w:tcW w:w="2709" w:type="dxa"/>
+            <w:tcBorders>
+              <w:top w:val="single" w:sz="2" w:space="0" w:color="70AD47" w:themeColor="accent6"/>
+              <w:left w:val="single" w:sz="2" w:space="0" w:color="70AD47" w:themeColor="accent6"/>
+              <w:bottom w:val="single" w:sz="2" w:space="0" w:color="70AD47" w:themeColor="accent6"/>
+              <w:right w:val="single" w:sz="2" w:space="0" w:color="70AD47" w:themeColor="accent6"/>
+            </w:tcBorders>
+            <w:vAlign w:val="center"/>
+          </w:tcPr>
+          <w:p>
+            <w:pPr>
+              <w:jc w:val="center"/>
+              <w:rPr>
+                <w:rFonts w:ascii="Times New Roman" w:eastAsia="SimSun" w:hAnsi="Times New Roman"/>
+              </w:rPr>
+            </w:pPr>
+            <w:r>
+              <w:rPr>
+                <w:rFonts w:ascii="Times New Roman" w:eastAsia="SimSun" w:hAnsi="Times New Roman" w:hint="eastAsia"/>
+                <w:sz w:val="21"/>
+              </w:rPr>
+              <w:t>自动考卷所需</w:t>
+            </w:r>
+            <w:r>
+              <w:rPr>
+                <w:rFonts w:ascii="Times New Roman" w:eastAsia="SimSun" w:hAnsi="Times New Roman" w:hint="eastAsia"/>
+                <w:sz w:val="21"/>
+              </w:rPr>
+              <w:t>难</w:t>
+            </w:r>
+            <w:r>
+              <w:rPr>
+                <w:rFonts w:ascii="Times New Roman" w:eastAsia="SimSun" w:hAnsi="Times New Roman" w:hint="eastAsia"/>
+                <w:sz w:val="21"/>
+              </w:rPr>
+              <w:t>题</w:t>
+            </w:r>
+          </w:p>
+        </w:tc>
+      </w:tr>
+      <w:tr>
+        <w:tc>
+          <w:tcPr>
+            <w:tcW w:w="2253" w:type="dxa"/>
+            <w:tcBorders>
+              <w:top w:val="single" w:sz="2" w:space="0" w:color="70AD47" w:themeColor="accent6"/>
+              <w:left w:val="single" w:sz="2" w:space="0" w:color="70AD47" w:themeColor="accent6"/>
+              <w:bottom w:val="single" w:sz="2" w:space="0" w:color="70AD47" w:themeColor="accent6"/>
+              <w:right w:val="single" w:sz="2" w:space="0" w:color="70AD47" w:themeColor="accent6"/>
+            </w:tcBorders>
+            <w:vAlign w:val="center"/>
+          </w:tcPr>
+          <w:p>
+            <w:pPr>
+              <w:jc w:val="center"/>
+              <w:rPr>
+                <w:rFonts w:ascii="Times New Roman" w:eastAsia="SimSun" w:hAnsi="Times New Roman"/>
+                <w:sz w:val="21"/>
+              </w:rPr>
+            </w:pPr>
+            <w:r>
+              <w:rPr>
+                <w:rFonts w:ascii="Times New Roman" w:eastAsia="SimSun" w:hAnsi="Times New Roman" w:hint="eastAsia"/>
+                <w:sz w:val="21"/>
+              </w:rPr>
+              <w:t>quest</w:t>
+            </w:r>
+            <w:r>
+              <w:rPr>
+                <w:rFonts w:ascii="Times New Roman" w:eastAsia="SimSun" w:hAnsi="Times New Roman"/>
+                <w:sz w:val="21"/>
+              </w:rPr>
+              <w:t>ion_id_array</w:t>
+            </w:r>
+          </w:p>
+        </w:tc>
+        <w:tc>
+          <w:tcPr>
+            <w:tcW w:w="1701" w:type="dxa"/>
+            <w:tcBorders>
+              <w:top w:val="single" w:sz="2" w:space="0" w:color="70AD47" w:themeColor="accent6"/>
+              <w:left w:val="single" w:sz="2" w:space="0" w:color="70AD47" w:themeColor="accent6"/>
+              <w:bottom w:val="single" w:sz="2" w:space="0" w:color="70AD47" w:themeColor="accent6"/>
+              <w:right w:val="single" w:sz="2" w:space="0" w:color="70AD47" w:themeColor="accent6"/>
+            </w:tcBorders>
+            <w:vAlign w:val="center"/>
+          </w:tcPr>
+          <w:p>
+            <w:pPr>
+              <w:jc w:val="center"/>
+              <w:rPr>
+                <w:rFonts w:ascii="Times New Roman" w:eastAsia="SimSun" w:hAnsi="Times New Roman"/>
+                <w:sz w:val="21"/>
+              </w:rPr>
+            </w:pPr>
+            <w:r>
+              <w:rPr>
+                <w:rFonts w:ascii="Times New Roman" w:eastAsia="SimSun" w:hAnsi="Times New Roman"/>
+                <w:sz w:val="21"/>
+              </w:rPr>
+              <w:t>varchar(256)</w:t>
+            </w:r>
+          </w:p>
+        </w:tc>
+        <w:tc>
+          <w:tcPr>
+            <w:tcW w:w="2694" w:type="dxa"/>
+            <w:tcBorders>
+              <w:top w:val="single" w:sz="2" w:space="0" w:color="70AD47" w:themeColor="accent6"/>
+              <w:left w:val="single" w:sz="2" w:space="0" w:color="70AD47" w:themeColor="accent6"/>
+              <w:bottom w:val="single" w:sz="2" w:space="0" w:color="70AD47" w:themeColor="accent6"/>
+              <w:right w:val="single" w:sz="2" w:space="0" w:color="70AD47" w:themeColor="accent6"/>
+            </w:tcBorders>
+            <w:vAlign w:val="center"/>
+          </w:tcPr>
+          <w:p>
+            <w:pPr>
+              <w:jc w:val="center"/>
+              <w:rPr>
+                <w:rFonts w:ascii="Times New Roman" w:eastAsia="SimSun" w:hAnsi="Times New Roman"/>
+                <w:sz w:val="21"/>
+              </w:rPr>
+            </w:pPr>
+            <w:r>
+              <w:rPr>
+                <w:rFonts w:ascii="Times New Roman" w:eastAsia="SimSun" w:hAnsi="Times New Roman" w:hint="eastAsia"/>
+                <w:sz w:val="21"/>
+              </w:rPr>
+              <w:t>无</w:t>
+            </w:r>
+          </w:p>
+        </w:tc>
+        <w:tc>
+          <w:tcPr>
+            <w:tcW w:w="2709" w:type="dxa"/>
+            <w:tcBorders>
+              <w:top w:val="single" w:sz="2" w:space="0" w:color="70AD47" w:themeColor="accent6"/>
+              <w:left w:val="single" w:sz="2" w:space="0" w:color="70AD47" w:themeColor="accent6"/>
+              <w:bottom w:val="single" w:sz="2" w:space="0" w:color="70AD47" w:themeColor="accent6"/>
+              <w:right w:val="single" w:sz="2" w:space="0" w:color="70AD47" w:themeColor="accent6"/>
+            </w:tcBorders>
+            <w:vAlign w:val="center"/>
+          </w:tcPr>
+          <w:p>
+            <w:pPr>
+              <w:jc w:val="center"/>
+              <w:rPr>
+                <w:rFonts w:ascii="Times New Roman" w:eastAsia="SimSun" w:hAnsi="Times New Roman"/>
+              </w:rPr>
+            </w:pPr>
+            <w:r>
+              <w:rPr>
+                <w:rFonts w:ascii="Times New Roman" w:eastAsia="SimSun" w:hAnsi="Times New Roman" w:hint="eastAsia"/>
+              </w:rPr>
+              <w:t>手动考卷问题编号</w:t>
+            </w:r>
+          </w:p>
+        </w:tc>
+      </w:tr>
+      <w:tr>
+        <w:tc>
+          <w:tcPr>
+            <w:tcW w:w="2253" w:type="dxa"/>
+            <w:tcBorders>
+              <w:top w:val="single" w:sz="2" w:space="0" w:color="70AD47" w:themeColor="accent6"/>
+              <w:left w:val="single" w:sz="2" w:space="0" w:color="70AD47" w:themeColor="accent6"/>
+              <w:bottom w:val="single" w:sz="2" w:space="0" w:color="70AD47" w:themeColor="accent6"/>
+              <w:right w:val="single" w:sz="2" w:space="0" w:color="70AD47" w:themeColor="accent6"/>
+            </w:tcBorders>
+            <w:vAlign w:val="center"/>
+          </w:tcPr>
+          <w:p>
+            <w:pPr>
+              <w:jc w:val="center"/>
+              <w:rPr>
+                <w:rFonts w:ascii="Times New Roman" w:eastAsia="SimSun" w:hAnsi="Times New Roman"/>
+                <w:sz w:val="21"/>
+              </w:rPr>
+            </w:pPr>
+            <w:r>
+              <w:rPr>
+                <w:rFonts w:ascii="Times New Roman" w:eastAsia="SimSun" w:hAnsi="Times New Roman" w:hint="eastAsia"/>
+                <w:sz w:val="21"/>
+              </w:rPr>
+              <w:t>exa</w:t>
+            </w:r>
+            <w:r>
+              <w:rPr>
+                <w:rFonts w:ascii="Times New Roman" w:eastAsia="SimSun" w:hAnsi="Times New Roman"/>
+                <w:sz w:val="21"/>
+              </w:rPr>
+              <w:t>m_paper_status</w:t>
+            </w:r>
+          </w:p>
+        </w:tc>
+        <w:tc>
+          <w:tcPr>
+            <w:tcW w:w="1701" w:type="dxa"/>
+            <w:tcBorders>
+              <w:top w:val="single" w:sz="2" w:space="0" w:color="70AD47" w:themeColor="accent6"/>
+              <w:left w:val="single" w:sz="2" w:space="0" w:color="70AD47" w:themeColor="accent6"/>
+              <w:bottom w:val="single" w:sz="2" w:space="0" w:color="70AD47" w:themeColor="accent6"/>
+              <w:right w:val="single" w:sz="2" w:space="0" w:color="70AD47" w:themeColor="accent6"/>
+            </w:tcBorders>
+            <w:vAlign w:val="center"/>
+          </w:tcPr>
+          <w:p>
+            <w:pPr>
+              <w:jc w:val="center"/>
+              <w:rPr>
+                <w:rFonts w:ascii="Times New Roman" w:eastAsia="SimSun" w:hAnsi="Times New Roman"/>
+                <w:sz w:val="21"/>
+              </w:rPr>
+            </w:pPr>
+            <w:r>
+              <w:rPr>
+                <w:rFonts w:ascii="Times New Roman" w:eastAsia="SimSun" w:hAnsi="Times New Roman"/>
+                <w:sz w:val="21"/>
+              </w:rPr>
+              <w:t>varchar(50)</w:t>
+            </w:r>
+          </w:p>
+        </w:tc>
+        <w:tc>
+          <w:tcPr>
+            <w:tcW w:w="2694" w:type="dxa"/>
+            <w:tcBorders>
+              <w:top w:val="single" w:sz="2" w:space="0" w:color="70AD47" w:themeColor="accent6"/>
+              <w:left w:val="single" w:sz="2" w:space="0" w:color="70AD47" w:themeColor="accent6"/>
+              <w:bottom w:val="single" w:sz="2" w:space="0" w:color="70AD47" w:themeColor="accent6"/>
+              <w:right w:val="single" w:sz="2" w:space="0" w:color="70AD47" w:themeColor="accent6"/>
+            </w:tcBorders>
+            <w:vAlign w:val="center"/>
+          </w:tcPr>
+          <w:p>
+            <w:pPr>
+              <w:jc w:val="center"/>
+              <w:rPr>
+                <w:rFonts w:ascii="Times New Roman" w:eastAsia="SimSun" w:hAnsi="Times New Roman"/>
+                <w:sz w:val="21"/>
+              </w:rPr>
+            </w:pPr>
+            <w:r>
+              <w:rPr>
+                <w:rFonts w:ascii="Times New Roman" w:eastAsia="SimSun" w:hAnsi="Times New Roman" w:hint="eastAsia"/>
+                <w:sz w:val="21"/>
+              </w:rPr>
+              <w:t>无</w:t>
+            </w:r>
+          </w:p>
+          <w:p>
+            <w:pPr>
+              <w:jc w:val="center"/>
+              <w:rPr>
+                <w:rFonts w:ascii="Times New Roman" w:eastAsia="SimSun" w:hAnsi="Times New Roman" w:hint="eastAsia"/>
+                <w:sz w:val="21"/>
+              </w:rPr>
+            </w:pPr>
+            <w:r>
+              <w:rPr>
+                <w:rFonts w:ascii="Times New Roman" w:eastAsia="SimSun" w:hAnsi="Times New Roman"/>
+                <w:sz w:val="21"/>
+              </w:rPr>
+              <w:t>(DEFAULT DRAFT)</w:t>
+            </w:r>
+          </w:p>
+        </w:tc>
+        <w:tc>
+          <w:tcPr>
+            <w:tcW w:w="2709" w:type="dxa"/>
+            <w:tcBorders>
+              <w:top w:val="single" w:sz="2" w:space="0" w:color="70AD47" w:themeColor="accent6"/>
+              <w:left w:val="single" w:sz="2" w:space="0" w:color="70AD47" w:themeColor="accent6"/>
+              <w:bottom w:val="single" w:sz="2" w:space="0" w:color="70AD47" w:themeColor="accent6"/>
+              <w:right w:val="single" w:sz="2" w:space="0" w:color="70AD47" w:themeColor="accent6"/>
+            </w:tcBorders>
+            <w:vAlign w:val="center"/>
+          </w:tcPr>
+          <w:p>
+            <w:pPr>
+              <w:jc w:val="center"/>
+              <w:rPr>
+                <w:rFonts w:ascii="Times New Roman" w:eastAsia="SimSun" w:hAnsi="Times New Roman"/>
+              </w:rPr>
+            </w:pPr>
+            <w:r>
+              <w:rPr>
+                <w:rFonts w:ascii="Times New Roman" w:eastAsia="SimSun" w:hAnsi="Times New Roman" w:hint="eastAsia"/>
+              </w:rPr>
+              <w:t>考卷状况</w:t>
+            </w:r>
+          </w:p>
+          <w:p>
+            <w:pPr>
+              <w:jc w:val="center"/>
+              <w:rPr>
+                <w:rFonts w:ascii="Times New Roman" w:eastAsia="SimSun" w:hAnsi="Times New Roman" w:hint="eastAsia"/>
+              </w:rPr>
+            </w:pPr>
+            <w:r>
+              <w:rPr>
+                <w:rFonts w:ascii="Times New Roman" w:eastAsia="SimSun" w:hAnsi="Times New Roman"/>
+              </w:rPr>
+              <w:t>(DRAFT, PUBLISHED)</w:t>
+            </w:r>
+          </w:p>
+        </w:tc>
+      </w:tr>
+    </w:tbl>
+    <w:p/>
+    <w:p/>
+    <w:p/>
+    <w:p/>
+    <w:p>
+      <w:pPr>
+        <w:rPr>
+          <w:rFonts w:hint="eastAsia"/>
+        </w:rPr>
+      </w:pPr>
+    </w:p>
+    <w:p>
+      <w:pPr>
+        <w:pStyle w:val="Heading1"/>
+      </w:pPr>
+      <w:r>
+        <w:t xml:space="preserve">System </w:t>
+      </w:r>
+      <w:r>
+        <w:t>Implementation</w:t>
+      </w:r>
+    </w:p>
+    <w:p>
+      <w:pPr>
         <w:pStyle w:val="Heading2"/>
+        <w:numPr>
+          <w:ilvl w:val="0"/>
+          <w:numId w:val="31"/>
+        </w:numPr>
         <w:rPr>
           <w:rFonts w:hint="eastAsia"/>
         </w:rPr>
@@ -12529,7 +14598,6 @@
           <w:sz w:val="24"/>
           <w:szCs w:val="24"/>
         </w:rPr>
-        <w:lastRenderedPageBreak/>
         <w:t>Heartbeat: Every 60 seconds, the Vue.js frontend sends a background request with current answers.</w:t>
       </w:r>
     </w:p>
@@ -12552,6 +14620,7 @@
           <w:sz w:val="24"/>
           <w:szCs w:val="24"/>
         </w:rPr>
+        <w:lastRenderedPageBreak/>
         <w:t>JSONB Storage: Spring Boot receives the answers and saves them as a single JSON object in the exam_sessions table (column progress_data).</w:t>
       </w:r>
     </w:p>
@@ -13565,7 +15634,6 @@
                 <w:rFonts w:ascii="Times New Roman" w:eastAsia="SimSun" w:hAnsi="Times New Roman"/>
                 <w:sz w:val="21"/>
               </w:rPr>
-              <w:lastRenderedPageBreak/>
               <w:t>Generate code</w:t>
             </w:r>
           </w:p>
@@ -13685,6 +15753,7 @@
                 <w:rFonts w:ascii="Times New Roman" w:eastAsia="SimSun" w:hAnsi="Times New Roman"/>
                 <w:sz w:val="21"/>
               </w:rPr>
+              <w:lastRenderedPageBreak/>
               <w:t>Action</w:t>
             </w:r>
           </w:p>
@@ -15256,7 +17325,13 @@
         <w:t>Menu</w:t>
       </w:r>
     </w:p>
-    <w:p/>
+    <w:p>
+      <w:pPr>
+        <w:rPr>
+          <w:rFonts w:hint="eastAsia"/>
+        </w:rPr>
+      </w:pPr>
+    </w:p>
     <w:p>
       <w:pPr>
         <w:pStyle w:val="Heading2"/>
@@ -15264,6 +17339,9 @@
           <w:ilvl w:val="0"/>
           <w:numId w:val="29"/>
         </w:numPr>
+        <w:rPr>
+          <w:rFonts w:hint="eastAsia"/>
+        </w:rPr>
       </w:pPr>
       <w:r>
         <w:t>Teacher API Collections</w:t>
@@ -15276,6 +17354,9 @@
           <w:ilvl w:val="0"/>
           <w:numId w:val="30"/>
         </w:numPr>
+        <w:rPr>
+          <w:rFonts w:hint="eastAsia"/>
+        </w:rPr>
       </w:pPr>
       <w:r>
         <w:t>Questions Service API</w:t>
@@ -15431,10 +17512,11 @@
   <w:abstractNum w:abstractNumId="1" w15:restartNumberingAfterBreak="0">
     <w:nsid w:val="099F5D06"/>
     <w:multiLevelType w:val="hybridMultilevel"/>
-    <w:tmpl w:val="F4B8DA64"/>
-    <w:lvl w:ilvl="0" w:tplc="EA22CD28">
+    <w:tmpl w:val="D57A3B52"/>
+    <w:lvl w:ilvl="0" w:tplc="367A2F2E">
       <w:start w:val="1"/>
       <w:numFmt w:val="decimal"/>
+      <w:pStyle w:val="Heading3"/>
       <w:lvlText w:val="(%1)"/>
       <w:lvlJc w:val="left"/>
       <w:pPr>
@@ -15665,7 +17747,7 @@
   <w:abstractNum w:abstractNumId="3" w15:restartNumberingAfterBreak="0">
     <w:nsid w:val="167E0476"/>
     <w:multiLevelType w:val="hybridMultilevel"/>
-    <w:tmpl w:val="0E2053AA"/>
+    <w:tmpl w:val="35B0F88E"/>
     <w:lvl w:ilvl="0" w:tplc="1BBA094E">
       <w:start w:val="1"/>
       <w:numFmt w:val="decimal"/>
@@ -17276,7 +19358,7 @@
   <w:abstractNum w:abstractNumId="18" w15:restartNumberingAfterBreak="0">
     <w:nsid w:val="5DDA3E48"/>
     <w:multiLevelType w:val="hybridMultilevel"/>
-    <w:tmpl w:val="878446CA"/>
+    <w:tmpl w:val="D4403656"/>
     <w:lvl w:ilvl="0" w:tplc="07967E62">
       <w:start w:val="1"/>
       <w:numFmt w:val="decimal"/>
@@ -18510,6 +20592,12 @@
   </w:num>
   <w:num w:numId="30">
     <w:abstractNumId w:val="10"/>
+  </w:num>
+  <w:num w:numId="31">
+    <w:abstractNumId w:val="18"/>
+    <w:lvlOverride w:ilvl="0">
+      <w:startOverride w:val="1"/>
+    </w:lvlOverride>
   </w:num>
 </w:numbering>
 </file>
@@ -18964,25 +21052,25 @@
   </w:style>
   <w:style w:type="paragraph" w:styleId="Heading3">
     <w:name w:val="heading 3"/>
-    <w:basedOn w:val="Normal"/>
+    <w:basedOn w:val="ListParagraph"/>
     <w:next w:val="Normal"/>
     <w:link w:val="Heading3Char"/>
     <w:uiPriority w:val="9"/>
-    <w:semiHidden/>
     <w:unhideWhenUsed/>
     <w:qFormat/>
-    <w:rsid w:val="00971851"/>
+    <w:rsid w:val="007706E0"/>
     <w:pPr>
-      <w:keepNext/>
-      <w:keepLines/>
-      <w:spacing w:before="40"/>
+      <w:numPr>
+        <w:numId w:val="25"/>
+      </w:numPr>
       <w:outlineLvl w:val="2"/>
     </w:pPr>
     <w:rPr>
-      <w:rFonts w:asciiTheme="majorHAnsi" w:eastAsiaTheme="majorEastAsia" w:hAnsiTheme="majorHAnsi" w:cstheme="majorBidi"/>
-      <w:color w:val="1F3763" w:themeColor="accent1" w:themeShade="7F"/>
+      <w:rFonts w:ascii="Times New Roman" w:eastAsia="SimSun" w:hAnsi="Times New Roman"/>
+      <w:b/>
+      <w:bCs/>
       <w:sz w:val="24"/>
-      <w:szCs w:val="39"/>
+      <w:szCs w:val="24"/>
     </w:rPr>
   </w:style>
   <w:style w:type="paragraph" w:styleId="Heading4">
@@ -19099,13 +21187,13 @@
     <w:basedOn w:val="DefaultParagraphFont"/>
     <w:link w:val="Heading3"/>
     <w:uiPriority w:val="9"/>
-    <w:semiHidden/>
-    <w:rsid w:val="00971851"/>
+    <w:rsid w:val="007706E0"/>
     <w:rPr>
-      <w:rFonts w:asciiTheme="majorHAnsi" w:eastAsiaTheme="majorEastAsia" w:hAnsiTheme="majorHAnsi" w:cstheme="majorBidi"/>
-      <w:color w:val="1F3763" w:themeColor="accent1" w:themeShade="7F"/>
+      <w:rFonts w:ascii="Times New Roman" w:eastAsia="SimSun" w:hAnsi="Times New Roman" w:cs="Times New Roman"/>
+      <w:b/>
+      <w:bCs/>
       <w:sz w:val="24"/>
-      <w:szCs w:val="39"/>
+      <w:szCs w:val="24"/>
     </w:rPr>
   </w:style>
   <w:style w:type="character" w:styleId="HTMLCode">

</xml_diff>